<commit_message>
review: import Laura's merged-draft comments (F-012..F-016); fix docx symbol rendering
Returned copy archived in review/returned/. Six comments: APC primer
suggestion (F-012), math-symbol rendering (F-013, fixed), table borders
(F-014), grandmothering ceiling mechanism (F-015), praise (F-016).

Co-Authored-By: Claude Fable 5 <noreply@anthropic.com>
</commit_message>
<xml_diff>
--- a/manuscript_2026/closing_corridor_merged.docx
+++ b/manuscript_2026/closing_corridor_merged.docx
@@ -1674,41 +1674,7 @@
         <w:t xml:space="preserve"> </w:t>
       </w:r>
       <w:r>
-        <w:t xml:space="preserve">years are retained under the collection preference STAT</w:t>
-      </w:r>
-      <w:r>
-        <w:t xml:space="preserve"> </w:t>
-      </w:r>
-      <m:oMath>
-        <m:r>
-          <m:rPr>
-            <m:sty m:val="p"/>
-          </m:rPr>
-          <m:t>&gt;</m:t>
-        </m:r>
-      </m:oMath>
-      <w:r>
-        <w:t xml:space="preserve"> </w:t>
-      </w:r>
-      <w:r>
-        <w:t xml:space="preserve">ODE</w:t>
-      </w:r>
-      <w:r>
-        <w:t xml:space="preserve"> </w:t>
-      </w:r>
-      <m:oMath>
-        <m:r>
-          <m:rPr>
-            <m:sty m:val="p"/>
-          </m:rPr>
-          <m:t>&gt;</m:t>
-        </m:r>
-      </m:oMath>
-      <w:r>
-        <w:t xml:space="preserve"> </w:t>
-      </w:r>
-      <w:r>
-        <w:t xml:space="preserve">RE;</w:t>
+        <w:t xml:space="preserve">years are retained under the collection preference STAT &gt; ODE &gt; RE;</w:t>
       </w:r>
       <w:r>
         <w:t xml:space="preserve"> </w:t>
@@ -1814,24 +1780,7 @@
         <w:t xml:space="preserve"> </w:t>
       </w:r>
       <w:r>
-        <w:t xml:space="preserve">(reversed) level-plot shading of ASFR on birth-year</w:t>
-      </w:r>
-      <w:r>
-        <w:t xml:space="preserve"> </w:t>
-      </w:r>
-      <m:oMath>
-        <m:r>
-          <m:rPr>
-            <m:sty m:val="p"/>
-          </m:rPr>
-          <m:t>×</m:t>
-        </m:r>
-      </m:oMath>
-      <w:r>
-        <w:t xml:space="preserve"> </w:t>
-      </w:r>
-      <w:r>
-        <w:t xml:space="preserve">age panels,</w:t>
+        <w:t xml:space="preserve">(reversed) level-plot shading of ASFR on birth-year × age panels,</w:t>
       </w:r>
       <w:r>
         <w:t xml:space="preserve"> </w:t>
@@ -1935,24 +1884,7 @@
         <w:t xml:space="preserve"> </w:t>
       </w:r>
       <w:r>
-        <w:t xml:space="preserve">which ASFR</w:t>
-      </w:r>
-      <w:r>
-        <w:t xml:space="preserve"> </w:t>
-      </w:r>
-      <m:oMath>
-        <m:r>
-          <m:rPr>
-            <m:sty m:val="p"/>
-          </m:rPr>
-          <m:t>≥</m:t>
-        </m:r>
-      </m:oMath>
-      <w:r>
-        <w:t xml:space="preserve"> </w:t>
-      </w:r>
-      <w:r>
-        <w:t xml:space="preserve">1/200 (primary threshold), with 1/1000 as a sensitivity</w:t>
+        <w:t xml:space="preserve">which ASFR ≥ 1/200 (primary threshold), with 1/1000 as a sensitivity</w:t>
       </w:r>
       <w:r>
         <w:t xml:space="preserve"> </w:t>
@@ -3794,24 +3726,7 @@
         <w:pStyle w:val="BodyText"/>
       </w:pPr>
       <w:r>
-        <w:t xml:space="preserve">Defining the effective ceiling as the highest age with ASFR</w:t>
-      </w:r>
-      <w:r>
-        <w:t xml:space="preserve"> </w:t>
-      </w:r>
-      <m:oMath>
-        <m:r>
-          <m:rPr>
-            <m:sty m:val="p"/>
-          </m:rPr>
-          <m:t>≥</m:t>
-        </m:r>
-      </m:oMath>
-      <w:r>
-        <w:t xml:space="preserve"> </w:t>
-      </w:r>
-      <w:r>
-        <w:t xml:space="preserve">1/200,</w:t>
+        <w:t xml:space="preserve">Defining the effective ceiling as the highest age with ASFR ≥ 1/200,</w:t>
       </w:r>
       <w:r>
         <w:t xml:space="preserve"> </w:t>

</xml_diff>

<commit_message>
feat: the squeeze — peak fertility age vs effective ceiling (F-017); Laura's round actioned (F-012/014/015)
New analysis distilling each surface to peak age (shaded by ASFR at
peak) against the ceiling: pooled medians peak 24→31, ceiling 45→41→43,
gap 20→12 years, peak ASFR 0.19→0.11 — the age-structure mechanics
beneath the TFR convergence-down (Ritchie, OWID Data Insight 2026-07-16,
cited). APC primer added to Introduction (F-012, US worked example);
grandmothering/kin-care ceiling mechanism with verified citations
(F-015, credited to Laura Vanderbloemen); Word table borders via
custom-reference.docx (F-014); Burn-Murdoch FT column (May 2026) bib
entry prepared and cited in Introduction.

Co-Authored-By: Claude Fable 5 <noreply@anthropic.com>
</commit_message>
<xml_diff>
--- a/manuscript_2026/closing_corridor_merged.docx
+++ b/manuscript_2026/closing_corridor_merged.docx
@@ -275,7 +275,37 @@
         <w:t xml:space="preserve"> </w:t>
       </w:r>
       <w:r>
-        <w:t xml:space="preserve">43 of 45 countries’ recent cohorts. CONCLUSIONS — A decade of new data</w:t>
+        <w:t xml:space="preserve">43 of 45 countries’ recent cohorts. Distilling each surface to three</w:t>
+      </w:r>
+      <w:r>
+        <w:t xml:space="preserve"> </w:t>
+      </w:r>
+      <w:r>
+        <w:t xml:space="preserve">numbers per year shows the squeeze panel-wide: the median age of peak</w:t>
+      </w:r>
+      <w:r>
+        <w:t xml:space="preserve"> </w:t>
+      </w:r>
+      <w:r>
+        <w:t xml:space="preserve">fertility rose from 24 to 31 while the ceiling recovered only to 43, the</w:t>
+      </w:r>
+      <w:r>
+        <w:t xml:space="preserve"> </w:t>
+      </w:r>
+      <w:r>
+        <w:t xml:space="preserve">peak-to-ceiling distance narrowing from twenty years to twelve as the rate</w:t>
+      </w:r>
+      <w:r>
+        <w:t xml:space="preserve"> </w:t>
+      </w:r>
+      <w:r>
+        <w:t xml:space="preserve">at the peak nearly halved — the age-structure mechanics beneath the widely</w:t>
+      </w:r>
+      <w:r>
+        <w:t xml:space="preserve"> </w:t>
+      </w:r>
+      <w:r>
+        <w:t xml:space="preserve">noted convergence of total fertility rates. CONCLUSIONS — A decade of new data</w:t>
       </w:r>
       <w:r>
         <w:t xml:space="preserve"> </w:t>
@@ -745,7 +775,61 @@
         <w:t xml:space="preserve"> </w:t>
       </w:r>
       <w:r>
-        <w:t xml:space="preserve">popular following and a growing research literature, from broadband and</w:t>
+        <w:t xml:space="preserve">popular following — carried above all by data journalism in the</w:t>
+      </w:r>
+      <w:r>
+        <w:t xml:space="preserve"> </w:t>
+      </w:r>
+      <w:r>
+        <w:rPr>
+          <w:i/>
+          <w:iCs/>
+        </w:rPr>
+        <w:t xml:space="preserve">Financial</w:t>
+      </w:r>
+      <w:r>
+        <w:rPr>
+          <w:i/>
+          <w:iCs/>
+        </w:rPr>
+        <w:t xml:space="preserve"> </w:t>
+      </w:r>
+      <w:r>
+        <w:rPr>
+          <w:i/>
+          <w:iCs/>
+        </w:rPr>
+        <w:t xml:space="preserve">Times</w:t>
+      </w:r>
+      <w:r>
+        <w:t xml:space="preserve"> </w:t>
+      </w:r>
+      <w:r>
+        <w:t xml:space="preserve">arguing that mass smartphone adoption tracks the decline’s timing</w:t>
+      </w:r>
+      <w:r>
+        <w:t xml:space="preserve"> </w:t>
+      </w:r>
+      <w:r>
+        <w:t xml:space="preserve">across otherwise dissimilar countries</w:t>
+      </w:r>
+      <w:r>
+        <w:t xml:space="preserve"> </w:t>
+      </w:r>
+      <w:r>
+        <w:t xml:space="preserve">(Burn-Murdoch 2026)</w:t>
+      </w:r>
+      <w:r>
+        <w:t xml:space="preserve"> </w:t>
+      </w:r>
+      <w:r>
+        <w:t xml:space="preserve">— and a</w:t>
+      </w:r>
+      <w:r>
+        <w:t xml:space="preserve"> </w:t>
+      </w:r>
+      <w:r>
+        <w:t xml:space="preserve">growing research literature, from broadband and</w:t>
       </w:r>
       <w:r>
         <w:t xml:space="preserve"> </w:t>
@@ -904,25 +988,64 @@
         <w:t xml:space="preserve"> </w:t>
       </w:r>
       <w:r>
-        <w:t xml:space="preserve">whether the change arrived everywhere at once or diffused. What preserves</w:t>
-      </w:r>
-      <w:r>
-        <w:t xml:space="preserve"> </w:t>
-      </w:r>
-      <w:r>
-        <w:t xml:space="preserve">that structure is the fertility surface — age by cohort by rate — and a</w:t>
-      </w:r>
-      <w:r>
-        <w:t xml:space="preserve"> </w:t>
-      </w:r>
-      <w:r>
-        <w:t xml:space="preserve">practice of reading it that a 2020 paper by Pattaro, Vanderbloemen and</w:t>
-      </w:r>
-      <w:r>
-        <w:t xml:space="preserve"> </w:t>
-      </w:r>
-      <w:r>
-        <w:t xml:space="preserve">Minton developed for exactly this comparative purpose</w:t>
+        <w:t xml:space="preserve">whether the change arrived everywhere at once or diffused. The limitation is</w:t>
+      </w:r>
+      <w:r>
+        <w:t xml:space="preserve"> </w:t>
+      </w:r>
+      <w:r>
+        <w:t xml:space="preserve">not hypothetical: the most widely read descriptive accounts of the decline</w:t>
+      </w:r>
+      <w:r>
+        <w:t xml:space="preserve"> </w:t>
+      </w:r>
+      <w:r>
+        <w:t xml:space="preserve">are TFR-based — a recent Our World in Data insight documents fertility rates</w:t>
+      </w:r>
+      <w:r>
+        <w:t xml:space="preserve"> </w:t>
+      </w:r>
+      <w:r>
+        <w:t xml:space="preserve">converging steeply downward across countries with very different starting</w:t>
+      </w:r>
+      <w:r>
+        <w:t xml:space="preserve"> </w:t>
+      </w:r>
+      <w:r>
+        <w:t xml:space="preserve">points, while offering, by construction, no account of the ages through</w:t>
+      </w:r>
+      <w:r>
+        <w:t xml:space="preserve"> </w:t>
+      </w:r>
+      <w:r>
+        <w:t xml:space="preserve">which the convergence ran</w:t>
+      </w:r>
+      <w:r>
+        <w:t xml:space="preserve"> </w:t>
+      </w:r>
+      <w:r>
+        <w:t xml:space="preserve">(Ritchie 2026)</w:t>
+      </w:r>
+      <w:r>
+        <w:t xml:space="preserve">. What preserves that</w:t>
+      </w:r>
+      <w:r>
+        <w:t xml:space="preserve"> </w:t>
+      </w:r>
+      <w:r>
+        <w:t xml:space="preserve">structure is the fertility surface — age by cohort by rate — and a practice</w:t>
+      </w:r>
+      <w:r>
+        <w:t xml:space="preserve"> </w:t>
+      </w:r>
+      <w:r>
+        <w:t xml:space="preserve">of reading it that a 2020 paper by Pattaro, Vanderbloemen and Minton</w:t>
+      </w:r>
+      <w:r>
+        <w:t xml:space="preserve"> </w:t>
+      </w:r>
+      <w:r>
+        <w:t xml:space="preserve">developed for exactly this comparative purpose</w:t>
       </w:r>
       <w:r>
         <w:t xml:space="preserve"> </w:t>
@@ -932,6 +1055,128 @@
       </w:r>
       <w:r>
         <w:t xml:space="preserve">.</w:t>
+      </w:r>
+    </w:p>
+    <w:p>
+      <w:pPr>
+        <w:pStyle w:val="BodyText"/>
+      </w:pPr>
+      <w:r>
+        <w:t xml:space="preserve">A reader coming to these debates fresh needs one distinction above all:</w:t>
+      </w:r>
+      <w:r>
+        <w:t xml:space="preserve"> </w:t>
+      </w:r>
+      <w:r>
+        <w:t xml:space="preserve">between age, period, and cohort effects. Age effects are lifecycle</w:t>
+      </w:r>
+      <w:r>
+        <w:t xml:space="preserve"> </w:t>
+      </w:r>
+      <w:r>
+        <w:t xml:space="preserve">regularities — fertility concentrated in the twenties and early thirties.</w:t>
+      </w:r>
+      <w:r>
+        <w:t xml:space="preserve"> </w:t>
+      </w:r>
+      <w:r>
+        <w:t xml:space="preserve">Period effects strike all ages in the same calendar years: a crisis, a</w:t>
+      </w:r>
+      <w:r>
+        <w:t xml:space="preserve"> </w:t>
+      </w:r>
+      <w:r>
+        <w:t xml:space="preserve">pandemic, a price shock. Cohort effects travel with generations, set early</w:t>
+      </w:r>
+      <w:r>
+        <w:t xml:space="preserve"> </w:t>
+      </w:r>
+      <w:r>
+        <w:t xml:space="preserve">and carried forward as each cohort ages. The three are easy to conflate and</w:t>
+      </w:r>
+      <w:r>
+        <w:t xml:space="preserve"> </w:t>
+      </w:r>
+      <w:r>
+        <w:t xml:space="preserve">expensive to confuse, and the United States supplies the cautionary example</w:t>
+      </w:r>
+      <w:r>
+        <w:t xml:space="preserve"> </w:t>
+      </w:r>
+      <w:r>
+        <w:t xml:space="preserve">this paper returns to repeatedly: its period TFR fell from 2.12 to 1.59</w:t>
+      </w:r>
+      <w:r>
+        <w:t xml:space="preserve"> </w:t>
+      </w:r>
+      <w:r>
+        <w:t xml:space="preserve">after 2007, so on period evidence alone the American fertility exception</w:t>
+      </w:r>
+      <w:r>
+        <w:t xml:space="preserve"> </w:t>
+      </w:r>
+      <w:r>
+        <w:t xml:space="preserve">died in the financial crisis — yet cohort-cumulative milestones show women</w:t>
+      </w:r>
+      <w:r>
+        <w:t xml:space="preserve"> </w:t>
+      </w:r>
+      <w:r>
+        <w:t xml:space="preserve">born as late as 1984 completing replacement-level childbearing in the</w:t>
+      </w:r>
+      <w:r>
+        <w:t xml:space="preserve"> </w:t>
+      </w:r>
+      <w:r>
+        <w:t xml:space="preserve">2020s. Period accounting misdates the end of the US exception by nearly two</w:t>
+      </w:r>
+      <w:r>
+        <w:t xml:space="preserve"> </w:t>
+      </w:r>
+      <w:r>
+        <w:t xml:space="preserve">decades, because postponed births are debited to the years in which they</w:t>
+      </w:r>
+      <w:r>
+        <w:t xml:space="preserve"> </w:t>
+      </w:r>
+      <w:r>
+        <w:t xml:space="preserve">did not occur rather than credited to the cohorts that eventually had them</w:t>
+      </w:r>
+      <w:r>
+        <w:t xml:space="preserve"> </w:t>
+      </w:r>
+      <w:r>
+        <w:t xml:space="preserve">(Sobotka 2017)</w:t>
+      </w:r>
+      <w:r>
+        <w:t xml:space="preserve">. Keeping the three effects distinguishable is what</w:t>
+      </w:r>
+      <w:r>
+        <w:t xml:space="preserve"> </w:t>
+      </w:r>
+      <w:r>
+        <w:t xml:space="preserve">Lexis-surface methods are for</w:t>
+      </w:r>
+      <w:r>
+        <w:t xml:space="preserve"> </w:t>
+      </w:r>
+      <w:r>
+        <w:t xml:space="preserve">(Pattaro et al. 2020; Burkimsher 2017)</w:t>
+      </w:r>
+      <w:r>
+        <w:t xml:space="preserve">: on the</w:t>
+      </w:r>
+      <w:r>
+        <w:t xml:space="preserve"> </w:t>
+      </w:r>
+      <w:r>
+        <w:t xml:space="preserve">surfaces used throughout this paper, age runs up the vertical axis, cohorts</w:t>
+      </w:r>
+      <w:r>
+        <w:t xml:space="preserve"> </w:t>
+      </w:r>
+      <w:r>
+        <w:t xml:space="preserve">run along the horizontal, and period effects appear as diagonal bands.</w:t>
       </w:r>
     </w:p>
     <w:p>
@@ -3586,7 +3831,7 @@
     </w:p>
     <w:bookmarkEnd w:id="43"/>
     <w:bookmarkEnd w:id="44"/>
-    <w:bookmarkStart w:id="65" w:name="results-ii-the-ceiling-and-the-corridor"/>
+    <w:bookmarkStart w:id="70" w:name="results-ii-the-ceiling-and-the-corridor"/>
     <w:p>
       <w:pPr>
         <w:pStyle w:val="Heading1"/>
@@ -3806,6 +4051,141 @@
         <w:t xml:space="preserve">behaves like a structural feature, not a margin under active renegotiation.</w:t>
       </w:r>
     </w:p>
+    <w:p>
+      <w:pPr>
+        <w:pStyle w:val="BodyText"/>
+      </w:pPr>
+      <w:r>
+        <w:t xml:space="preserve">Why did the ceiling fall, and why does it stay low? Parity control is the</w:t>
+      </w:r>
+      <w:r>
+        <w:t xml:space="preserve"> </w:t>
+      </w:r>
+      <w:r>
+        <w:t xml:space="preserve">canonical mechanism: stopping behaviour truncated high-parity childbearing</w:t>
+      </w:r>
+      <w:r>
+        <w:t xml:space="preserve"> </w:t>
+      </w:r>
+      <w:r>
+        <w:t xml:space="preserve">from the top down. But stopping plausibly interacts with a second,</w:t>
+      </w:r>
+      <w:r>
+        <w:t xml:space="preserve"> </w:t>
+      </w:r>
+      <w:r>
+        <w:t xml:space="preserve">intergenerational channel. As first births moved later and maternal</w:t>
+      </w:r>
+      <w:r>
+        <w:t xml:space="preserve"> </w:t>
+      </w:r>
+      <w:r>
+        <w:t xml:space="preserve">employment rose against scarce formal childcare, women in their forties</w:t>
+      </w:r>
+      <w:r>
+        <w:t xml:space="preserve"> </w:t>
+      </w:r>
+      <w:r>
+        <w:t xml:space="preserve">increasingly occupy the years the old ceiling once covered as</w:t>
+      </w:r>
+      <w:r>
+        <w:t xml:space="preserve"> </w:t>
+      </w:r>
+      <w:r>
+        <w:rPr>
+          <w:i/>
+          <w:iCs/>
+        </w:rPr>
+        <w:t xml:space="preserve">grandmothers</w:t>
+      </w:r>
+      <w:r>
+        <w:t xml:space="preserve">: the late reproductive years are reallocated to the care of</w:t>
+      </w:r>
+      <w:r>
+        <w:t xml:space="preserve"> </w:t>
+      </w:r>
+      <w:r>
+        <w:t xml:space="preserve">daughters’ children rather than to continued childbearing. Such a</w:t>
+      </w:r>
+      <w:r>
+        <w:t xml:space="preserve"> </w:t>
+      </w:r>
+      <w:r>
+        <w:t xml:space="preserve">reallocation is consistent with the life-history literature on the</w:t>
+      </w:r>
+      <w:r>
+        <w:t xml:space="preserve"> </w:t>
+      </w:r>
+      <w:r>
+        <w:t xml:space="preserve">distinctively long human post-reproductive helping span</w:t>
+      </w:r>
+      <w:r>
+        <w:t xml:space="preserve"> </w:t>
+      </w:r>
+      <w:r>
+        <w:t xml:space="preserve">(Hawkes et al. 1998)</w:t>
+      </w:r>
+      <w:r>
+        <w:t xml:space="preserve">, and</w:t>
+      </w:r>
+      <w:r>
+        <w:t xml:space="preserve"> </w:t>
+      </w:r>
+      <w:r>
+        <w:t xml:space="preserve">with evidence that available grandparental childcare raises daughters’</w:t>
+      </w:r>
+      <w:r>
+        <w:t xml:space="preserve"> </w:t>
+      </w:r>
+      <w:r>
+        <w:t xml:space="preserve">fertility and fertility intentions</w:t>
+      </w:r>
+      <w:r>
+        <w:t xml:space="preserve"> </w:t>
+      </w:r>
+      <w:r>
+        <w:t xml:space="preserve">(Aassve et al. 2012; Tanskanen and Rotkirch 2014)</w:t>
+      </w:r>
+      <w:r>
+        <w:t xml:space="preserve">. On this reading the modern ceiling is not</w:t>
+      </w:r>
+      <w:r>
+        <w:t xml:space="preserve"> </w:t>
+      </w:r>
+      <w:r>
+        <w:t xml:space="preserve">merely a residue of stopping; it is actively maintained by a kin division</w:t>
+      </w:r>
+      <w:r>
+        <w:t xml:space="preserve"> </w:t>
+      </w:r>
+      <w:r>
+        <w:t xml:space="preserve">of labour in which a forty-something cohort adds descendants faster through</w:t>
+      </w:r>
+      <w:r>
+        <w:t xml:space="preserve"> </w:t>
+      </w:r>
+      <w:r>
+        <w:t xml:space="preserve">its children’s fertility than through its own. The reading carries a</w:t>
+      </w:r>
+      <w:r>
+        <w:t xml:space="preserve"> </w:t>
+      </w:r>
+      <w:r>
+        <w:t xml:space="preserve">testable signature — ceiling recovery should be slowest where grandparental</w:t>
+      </w:r>
+      <w:r>
+        <w:t xml:space="preserve"> </w:t>
+      </w:r>
+      <w:r>
+        <w:t xml:space="preserve">childcare substitutes most for formal provision — which we flag for the</w:t>
+      </w:r>
+      <w:r>
+        <w:t xml:space="preserve"> </w:t>
+      </w:r>
+      <w:r>
+        <w:t xml:space="preserve">parity-specific extension discussed below.</w:t>
+      </w:r>
+    </w:p>
     <w:bookmarkEnd w:id="49"/>
     <w:bookmarkStart w:id="50" w:name="the-mass-behind-the-ceiling-is-small"/>
     <w:p>
@@ -3894,13 +4274,13 @@
       </w:r>
     </w:p>
     <w:bookmarkEnd w:id="50"/>
-    <w:bookmarkStart w:id="55" w:name="X0a780e212b22766aa82f46d6bdccdf7da0037c5"/>
+    <w:bookmarkStart w:id="55" w:name="the-squeeze-peak-age-against-the-ceiling"/>
     <w:p>
       <w:pPr>
         <w:pStyle w:val="Heading2"/>
       </w:pPr>
       <w:r>
-        <w:t xml:space="preserve">Reachability: where the replacement contour meets the wall</w:t>
+        <w:t xml:space="preserve">The squeeze: peak age against the ceiling</w:t>
       </w:r>
     </w:p>
     <w:tbl>
@@ -3916,7 +4296,7 @@
       <w:tr>
         <w:tc>
           <w:tcPr/>
-          <w:bookmarkStart w:id="54" w:name="fig-reach"/>
+          <w:bookmarkStart w:id="54" w:name="fig-squeeze"/>
           <w:p>
             <w:pPr>
               <w:pStyle w:val="Compact"/>
@@ -3925,20 +4305,337 @@
             <w:r>
               <w:drawing>
                 <wp:inline>
-                  <wp:extent cx="5334000" cy="5334000"/>
+                  <wp:extent cx="5334000" cy="5600474"/>
                   <wp:effectExtent b="0" l="0" r="0" t="0"/>
                   <wp:docPr descr="" title="" id="52" name="Picture"/>
                   <a:graphic>
                     <a:graphicData uri="http://schemas.openxmlformats.org/drawingml/2006/picture">
                       <pic:pic>
                         <pic:nvPicPr>
-                          <pic:cNvPr descr="figures/reachability_crossing_ages.png" id="53" name="Picture"/>
+                          <pic:cNvPr descr="figures/squeeze_trajectories.png" id="53" name="Picture"/>
                           <pic:cNvPicPr>
                             <a:picLocks noChangeArrowheads="1" noChangeAspect="1"/>
                           </pic:cNvPicPr>
                         </pic:nvPicPr>
                         <pic:blipFill>
                           <a:blip r:embed="rId51"/>
+                          <a:stretch>
+                            <a:fillRect/>
+                          </a:stretch>
+                        </pic:blipFill>
+                        <pic:spPr bwMode="auto">
+                          <a:xfrm>
+                            <a:off x="0" y="0"/>
+                            <a:ext cx="5334000" cy="5600474"/>
+                          </a:xfrm>
+                          <a:prstGeom prst="rect">
+                            <a:avLst/>
+                          </a:prstGeom>
+                          <a:noFill/>
+                          <a:ln w="9525">
+                            <a:noFill/>
+                            <a:headEnd/>
+                            <a:tailEnd/>
+                          </a:ln>
+                        </pic:spPr>
+                      </pic:pic>
+                    </a:graphicData>
+                  </a:graphic>
+                </wp:inline>
+              </w:drawing>
+            </w:r>
+          </w:p>
+          <w:p>
+            <w:pPr>
+              <w:jc w:val="center"/>
+            </w:pPr>
+            <w:pPr>
+              <w:jc w:val="left"/>
+              <w:spacing w:before="200"/>
+              <w:pStyle w:val="ImageCaption"/>
+            </w:pPr>
+            <w:r>
+              <w:t xml:space="preserve">Figure 7: The squeeze across the panel, 1950–2025: modal age of the fertility schedule (points, shaded by the ASFR at the peak — darker is higher, matching the surfaces) rising toward the effective ceiling (line).</w:t>
+            </w:r>
+          </w:p>
+          <w:bookmarkEnd w:id="54"/>
+        </w:tc>
+      </w:tr>
+    </w:tbl>
+    <w:p>
+      <w:pPr>
+        <w:pStyle w:val="BodyText"/>
+      </w:pPr>
+      <w:r>
+        <w:t xml:space="preserve">The surfaces contain a simpler story that can be distilled into three</w:t>
+      </w:r>
+      <w:r>
+        <w:t xml:space="preserve"> </w:t>
+      </w:r>
+      <w:r>
+        <w:t xml:space="preserve">numbers per country-year: the modal (peak) age of the fertility schedule,</w:t>
+      </w:r>
+      <w:r>
+        <w:t xml:space="preserve"> </w:t>
+      </w:r>
+      <w:r>
+        <w:t xml:space="preserve">the ASFR at that peak, and the effective ceiling.</w:t>
+      </w:r>
+      <w:r>
+        <w:t xml:space="preserve"> </w:t>
+      </w:r>
+      <w:hyperlink w:anchor="fig-squeeze">
+        <w:r>
+          <w:rPr>
+            <w:rStyle w:val="Hyperlink"/>
+          </w:rPr>
+          <w:t xml:space="preserve">Figure 7</w:t>
+        </w:r>
+      </w:hyperlink>
+      <w:r>
+        <w:t xml:space="preserve"> </w:t>
+      </w:r>
+      <w:r>
+        <w:t xml:space="preserve">plots the</w:t>
+      </w:r>
+      <w:r>
+        <w:t xml:space="preserve"> </w:t>
+      </w:r>
+      <w:r>
+        <w:t xml:space="preserve">first against the third, with the second carried by shading. Pooled medians</w:t>
+      </w:r>
+      <w:r>
+        <w:t xml:space="preserve"> </w:t>
+      </w:r>
+      <w:r>
+        <w:t xml:space="preserve">across the panel: the peak age stood at 24 from the 1950s through the</w:t>
+      </w:r>
+      <w:r>
+        <w:t xml:space="preserve"> </w:t>
+      </w:r>
+      <w:r>
+        <w:t xml:space="preserve">1970s, then rose steadily — 25 (1980s), 27 (1990s), 29 (2000s), 30 (2010s),</w:t>
+      </w:r>
+      <w:r>
+        <w:t xml:space="preserve"> </w:t>
+      </w:r>
+      <w:r>
+        <w:t xml:space="preserve">31 (2020s) — while the ceiling descended from 45 to its 1980s–90s floor of</w:t>
+      </w:r>
+      <w:r>
+        <w:t xml:space="preserve"> </w:t>
+      </w:r>
+      <w:r>
+        <w:t xml:space="preserve">41 and recovered only to 43. The distance between where childbearing is</w:t>
+      </w:r>
+      <w:r>
+        <w:t xml:space="preserve"> </w:t>
+      </w:r>
+      <w:r>
+        <w:t xml:space="preserve">concentrated and where it effectively ends has narrowed from twenty years</w:t>
+      </w:r>
+      <w:r>
+        <w:t xml:space="preserve"> </w:t>
+      </w:r>
+      <w:r>
+        <w:t xml:space="preserve">to twelve — a forty percent contraction, closed mostly from below. The</w:t>
+      </w:r>
+      <w:r>
+        <w:t xml:space="preserve"> </w:t>
+      </w:r>
+      <w:r>
+        <w:t xml:space="preserve">shading adds a third fact: the peak is not only later but</w:t>
+      </w:r>
+      <w:r>
+        <w:t xml:space="preserve"> </w:t>
+      </w:r>
+      <w:r>
+        <w:rPr>
+          <w:i/>
+          <w:iCs/>
+        </w:rPr>
+        <w:t xml:space="preserve">lower</w:t>
+      </w:r>
+      <w:r>
+        <w:t xml:space="preserve">, the</w:t>
+      </w:r>
+      <w:r>
+        <w:t xml:space="preserve"> </w:t>
+      </w:r>
+      <w:r>
+        <w:t xml:space="preserve">median ASFR at the peak age falling by nearly half, from 0.19 (1960s) to</w:t>
+      </w:r>
+      <w:r>
+        <w:t xml:space="preserve"> </w:t>
+      </w:r>
+      <w:r>
+        <w:t xml:space="preserve">0.11 (2020s). Schedules have shifted later, flattened, and compressed</w:t>
+      </w:r>
+      <w:r>
+        <w:t xml:space="preserve"> </w:t>
+      </w:r>
+      <w:r>
+        <w:t xml:space="preserve">against a nearly fixed upper boundary.</w:t>
+      </w:r>
+    </w:p>
+    <w:p>
+      <w:pPr>
+        <w:pStyle w:val="BodyText"/>
+      </w:pPr>
+      <w:r>
+        <w:t xml:space="preserve">This, we suggest, is the age-structure mechanics beneath the convergence of</w:t>
+      </w:r>
+      <w:r>
+        <w:t xml:space="preserve"> </w:t>
+      </w:r>
+      <w:r>
+        <w:t xml:space="preserve">period fertility documented in TFR terms elsewhere</w:t>
+      </w:r>
+      <w:r>
+        <w:t xml:space="preserve"> </w:t>
+      </w:r>
+      <w:r>
+        <w:t xml:space="preserve">(Ritchie 2026; Wilson 2001; Dorius 2008)</w:t>
+      </w:r>
+      <w:r>
+        <w:t xml:space="preserve">. Convergence in the</w:t>
+      </w:r>
+      <w:r>
+        <w:t xml:space="preserve"> </w:t>
+      </w:r>
+      <w:r>
+        <w:t xml:space="preserve">total says nothing about the route; on the evidence of</w:t>
+      </w:r>
+      <w:r>
+        <w:t xml:space="preserve"> </w:t>
+      </w:r>
+      <w:hyperlink w:anchor="fig-squeeze">
+        <w:r>
+          <w:rPr>
+            <w:rStyle w:val="Hyperlink"/>
+          </w:rPr>
+          <w:t xml:space="preserve">Figure 7</w:t>
+        </w:r>
+      </w:hyperlink>
+      <w:r>
+        <w:t xml:space="preserve"> </w:t>
+      </w:r>
+      <w:r>
+        <w:t xml:space="preserve">the</w:t>
+      </w:r>
+      <w:r>
+        <w:t xml:space="preserve"> </w:t>
+      </w:r>
+      <w:r>
+        <w:t xml:space="preserve">route is common. Country after country — whether starting from South</w:t>
+      </w:r>
+      <w:r>
+        <w:t xml:space="preserve"> </w:t>
+      </w:r>
+      <w:r>
+        <w:t xml:space="preserve">Korea’s mid-century ceiling near 48 or the near-universal early peaks of</w:t>
+      </w:r>
+      <w:r>
+        <w:t xml:space="preserve"> </w:t>
+      </w:r>
+      <w:r>
+        <w:t xml:space="preserve">south-eastern Europe — arrives at the same configuration: a later, lower,</w:t>
+      </w:r>
+      <w:r>
+        <w:t xml:space="preserve"> </w:t>
+      </w:r>
+      <w:r>
+        <w:t xml:space="preserve">narrower schedule pressed against a low-forties ceiling. The corridor is</w:t>
+      </w:r>
+      <w:r>
+        <w:t xml:space="preserve"> </w:t>
+      </w:r>
+      <w:r>
+        <w:t xml:space="preserve">the shape into which the world’s fertility schedules are converging; the</w:t>
+      </w:r>
+      <w:r>
+        <w:t xml:space="preserve"> </w:t>
+      </w:r>
+      <w:r>
+        <w:t xml:space="preserve">TFR convergence is its one-dimensional shadow. Two caveats attach. The</w:t>
+      </w:r>
+      <w:r>
+        <w:t xml:space="preserve"> </w:t>
+      </w:r>
+      <w:r>
+        <w:t xml:space="preserve">modal age is read conservatively (ties broken to the youngest age, so flat</w:t>
+      </w:r>
+      <w:r>
+        <w:t xml:space="preserve"> </w:t>
+      </w:r>
+      <w:r>
+        <w:t xml:space="preserve">or plateau schedules — the United States’ historical plateau among them —</w:t>
+      </w:r>
+      <w:r>
+        <w:t xml:space="preserve"> </w:t>
+      </w:r>
+      <w:r>
+        <w:t xml:space="preserve">register early peaks), and single-year modal ages are noisy in small</w:t>
+      </w:r>
+      <w:r>
+        <w:t xml:space="preserve"> </w:t>
+      </w:r>
+      <w:r>
+        <w:t xml:space="preserve">populations: the per-country panels, not the pooled medians, are again the</w:t>
+      </w:r>
+      <w:r>
+        <w:t xml:space="preserve"> </w:t>
+      </w:r>
+      <w:r>
+        <w:t xml:space="preserve">primary output.</w:t>
+      </w:r>
+    </w:p>
+    <w:bookmarkEnd w:id="55"/>
+    <w:bookmarkStart w:id="60" w:name="X0a780e212b22766aa82f46d6bdccdf7da0037c5"/>
+    <w:p>
+      <w:pPr>
+        <w:pStyle w:val="Heading2"/>
+      </w:pPr>
+      <w:r>
+        <w:t xml:space="preserve">Reachability: where the replacement contour meets the wall</w:t>
+      </w:r>
+    </w:p>
+    <w:tbl>
+      <w:tblPr>
+        <w:tblStyle w:val="Table"/>
+        <w:tblW w:type="pct" w:w="5000"/>
+        <w:tblLayout w:type="fixed"/>
+        <w:tblLook w:firstRow="0" w:lastRow="0" w:firstColumn="0" w:lastColumn="0" w:noHBand="0" w:noVBand="0" w:val="0000"/>
+      </w:tblPr>
+      <w:tblGrid>
+        <w:gridCol w:w="7920"/>
+      </w:tblGrid>
+      <w:tr>
+        <w:tc>
+          <w:tcPr/>
+          <w:bookmarkStart w:id="59" w:name="fig-reach"/>
+          <w:p>
+            <w:pPr>
+              <w:pStyle w:val="Compact"/>
+              <w:jc w:val="center"/>
+            </w:pPr>
+            <w:r>
+              <w:drawing>
+                <wp:inline>
+                  <wp:extent cx="5334000" cy="5334000"/>
+                  <wp:effectExtent b="0" l="0" r="0" t="0"/>
+                  <wp:docPr descr="" title="" id="57" name="Picture"/>
+                  <a:graphic>
+                    <a:graphicData uri="http://schemas.openxmlformats.org/drawingml/2006/picture">
+                      <pic:pic>
+                        <pic:nvPicPr>
+                          <pic:cNvPr descr="figures/reachability_crossing_ages.png" id="58" name="Picture"/>
+                          <pic:cNvPicPr>
+                            <a:picLocks noChangeArrowheads="1" noChangeAspect="1"/>
+                          </pic:cNvPicPr>
+                        </pic:nvPicPr>
+                        <pic:blipFill>
+                          <a:blip r:embed="rId56"/>
                           <a:stretch>
                             <a:fillRect/>
                           </a:stretch>
@@ -3975,10 +4672,10 @@
               <w:pStyle w:val="ImageCaption"/>
             </w:pPr>
             <w:r>
-              <w:t xml:space="preserve">Figure 7: Age at which each cohort’s CPCFR reaches 2.05, by country; the dotted reference line marks age 43.</w:t>
+              <w:t xml:space="preserve">Figure 8: Age at which each cohort’s CPCFR reaches 2.05, by country; the dotted reference line marks age 43.</w:t>
             </w:r>
           </w:p>
-          <w:bookmarkEnd w:id="54"/>
+          <w:bookmarkEnd w:id="59"/>
         </w:tc>
       </w:tr>
     </w:tbl>
@@ -3994,7 +4691,7 @@
           <w:rPr>
             <w:rStyle w:val="Hyperlink"/>
           </w:rPr>
-          <w:t xml:space="preserve">Figure 7</w:t>
+          <w:t xml:space="preserve">Figure 8</w:t>
         </w:r>
       </w:hyperlink>
       <w:r>
@@ -4055,8 +4752,8 @@
         <w:t xml:space="preserve">cohort starting childbearing at today’s median ages.</w:t>
       </w:r>
     </w:p>
-    <w:bookmarkEnd w:id="55"/>
-    <w:bookmarkStart w:id="64" w:name="the-wall-on-the-surface"/>
+    <w:bookmarkEnd w:id="60"/>
+    <w:bookmarkStart w:id="69" w:name="the-wall-on-the-surface"/>
     <w:p>
       <w:pPr>
         <w:pStyle w:val="Heading2"/>
@@ -4078,7 +4775,7 @@
       <w:tr>
         <w:tc>
           <w:tcPr/>
-          <w:bookmarkStart w:id="59" w:name="fig-norwall"/>
+          <w:bookmarkStart w:id="64" w:name="fig-norwall"/>
           <w:p>
             <w:pPr>
               <w:pStyle w:val="Compact"/>
@@ -4089,18 +4786,18 @@
                 <wp:inline>
                   <wp:extent cx="5334000" cy="4667602"/>
                   <wp:effectExtent b="0" l="0" r="0" t="0"/>
-                  <wp:docPr descr="" title="" id="57" name="Picture"/>
+                  <wp:docPr descr="" title="" id="62" name="Picture"/>
                   <a:graphic>
                     <a:graphicData uri="http://schemas.openxmlformats.org/drawingml/2006/picture">
                       <pic:pic>
                         <pic:nvPicPr>
-                          <pic:cNvPr descr="figures/featured_wall_nor.png" id="58" name="Picture"/>
+                          <pic:cNvPr descr="figures/featured_wall_nor.png" id="63" name="Picture"/>
                           <pic:cNvPicPr>
                             <a:picLocks noChangeArrowheads="1" noChangeAspect="1"/>
                           </pic:cNvPicPr>
                         </pic:nvPicPr>
                         <pic:blipFill>
-                          <a:blip r:embed="rId56"/>
+                          <a:blip r:embed="rId61"/>
                           <a:stretch>
                             <a:fillRect/>
                           </a:stretch>
@@ -4137,10 +4834,10 @@
               <w:pStyle w:val="ImageCaption"/>
             </w:pPr>
             <w:r>
-              <w:t xml:space="preserve">Figure 8: Norway: composite surface with the effective ceiling overdrawn (dotted). Both vertical escapes of the 2.05 contour terminate at the ceiling.</w:t>
+              <w:t xml:space="preserve">Figure 9: Norway: composite surface with the effective ceiling overdrawn (dotted). Both vertical escapes of the 2.05 contour terminate at the ceiling.</w:t>
             </w:r>
           </w:p>
-          <w:bookmarkEnd w:id="59"/>
+          <w:bookmarkEnd w:id="64"/>
         </w:tc>
       </w:tr>
     </w:tbl>
@@ -4165,7 +4862,7 @@
       <w:tr>
         <w:tc>
           <w:tcPr/>
-          <w:bookmarkStart w:id="63" w:name="fig-usawall"/>
+          <w:bookmarkStart w:id="68" w:name="fig-usawall"/>
           <w:p>
             <w:pPr>
               <w:pStyle w:val="Compact"/>
@@ -4176,18 +4873,18 @@
                 <wp:inline>
                   <wp:extent cx="5334000" cy="4667602"/>
                   <wp:effectExtent b="0" l="0" r="0" t="0"/>
-                  <wp:docPr descr="" title="" id="61" name="Picture"/>
+                  <wp:docPr descr="" title="" id="66" name="Picture"/>
                   <a:graphic>
                     <a:graphicData uri="http://schemas.openxmlformats.org/drawingml/2006/picture">
                       <pic:pic>
                         <pic:nvPicPr>
-                          <pic:cNvPr descr="figures/featured_wall_usa.png" id="62" name="Picture"/>
+                          <pic:cNvPr descr="figures/featured_wall_usa.png" id="67" name="Picture"/>
                           <pic:cNvPicPr>
                             <a:picLocks noChangeArrowheads="1" noChangeAspect="1"/>
                           </pic:cNvPicPr>
                         </pic:nvPicPr>
                         <pic:blipFill>
-                          <a:blip r:embed="rId60"/>
+                          <a:blip r:embed="rId65"/>
                           <a:stretch>
                             <a:fillRect/>
                           </a:stretch>
@@ -4224,10 +4921,10 @@
               <w:pStyle w:val="ImageCaption"/>
             </w:pPr>
             <w:r>
-              <w:t xml:space="preserve">Figure 9: United States: composite surface with the effective ceiling overdrawn (dotted). The replacement contour climbs toward the ceiling but its right end is cut by the data edge: censored, not wall-terminated — the verdict on the 1985+ cohorts is still open.</w:t>
+              <w:t xml:space="preserve">Figure 10: United States: composite surface with the effective ceiling overdrawn (dotted). The replacement contour climbs toward the ceiling but its right end is cut by the data edge: censored, not wall-terminated — the verdict on the 1985+ cohorts is still open.</w:t>
             </w:r>
           </w:p>
-          <w:bookmarkEnd w:id="63"/>
+          <w:bookmarkEnd w:id="68"/>
         </w:tc>
       </w:tr>
     </w:tbl>
@@ -4277,35 +4974,6 @@
         <w:t xml:space="preserve">). For Norway (</w:t>
       </w:r>
       <w:hyperlink w:anchor="fig-norwall">
-        <w:r>
-          <w:rPr>
-            <w:rStyle w:val="Hyperlink"/>
-          </w:rPr>
-          <w:t xml:space="preserve">Figure 8</w:t>
-        </w:r>
-      </w:hyperlink>
-      <w:r>
-        <w:t xml:space="preserve">), both escapes of</w:t>
-      </w:r>
-      <w:r>
-        <w:t xml:space="preserve"> </w:t>
-      </w:r>
-      <w:r>
-        <w:t xml:space="preserve">the replacement contour are wall-terminations, not censoring artifacts: the</w:t>
-      </w:r>
-      <w:r>
-        <w:t xml:space="preserve"> </w:t>
-      </w:r>
-      <w:r>
-        <w:t xml:space="preserve">2020 forecast’s error is visible as the gap between open space assumed and</w:t>
-      </w:r>
-      <w:r>
-        <w:t xml:space="preserve"> </w:t>
-      </w:r>
-      <w:r>
-        <w:t xml:space="preserve">boundary present. For the United States (</w:t>
-      </w:r>
-      <w:hyperlink w:anchor="fig-usawall">
         <w:r>
           <w:rPr>
             <w:rStyle w:val="Hyperlink"/>
@@ -4314,6 +4982,35 @@
         </w:r>
       </w:hyperlink>
       <w:r>
+        <w:t xml:space="preserve">), both escapes of</w:t>
+      </w:r>
+      <w:r>
+        <w:t xml:space="preserve"> </w:t>
+      </w:r>
+      <w:r>
+        <w:t xml:space="preserve">the replacement contour are wall-terminations, not censoring artifacts: the</w:t>
+      </w:r>
+      <w:r>
+        <w:t xml:space="preserve"> </w:t>
+      </w:r>
+      <w:r>
+        <w:t xml:space="preserve">2020 forecast’s error is visible as the gap between open space assumed and</w:t>
+      </w:r>
+      <w:r>
+        <w:t xml:space="preserve"> </w:t>
+      </w:r>
+      <w:r>
+        <w:t xml:space="preserve">boundary present. For the United States (</w:t>
+      </w:r>
+      <w:hyperlink w:anchor="fig-usawall">
+        <w:r>
+          <w:rPr>
+            <w:rStyle w:val="Hyperlink"/>
+          </w:rPr>
+          <w:t xml:space="preserve">Figure 10</w:t>
+        </w:r>
+      </w:hyperlink>
+      <w:r>
         <w:t xml:space="preserve">), the right end of</w:t>
       </w:r>
       <w:r>
@@ -4422,9 +5119,9 @@
         <w:t xml:space="preserve">established four-encoding composite everywhere else.</w:t>
       </w:r>
     </w:p>
-    <w:bookmarkEnd w:id="64"/>
-    <w:bookmarkEnd w:id="65"/>
-    <w:bookmarkStart w:id="70" w:name="from-reading-surfaces-to-building-models"/>
+    <w:bookmarkEnd w:id="69"/>
+    <w:bookmarkEnd w:id="70"/>
+    <w:bookmarkStart w:id="75" w:name="from-reading-surfaces-to-building-models"/>
     <w:p>
       <w:pPr>
         <w:pStyle w:val="Heading1"/>
@@ -4433,7 +5130,7 @@
         <w:t xml:space="preserve">From reading surfaces to building models</w:t>
       </w:r>
     </w:p>
-    <w:bookmarkStart w:id="66" w:name="what-the-2020-forecasts-were"/>
+    <w:bookmarkStart w:id="71" w:name="what-the-2020-forecasts-were"/>
     <w:p>
       <w:pPr>
         <w:pStyle w:val="Heading2"/>
@@ -4550,8 +5247,8 @@
         <w:t xml:space="preserve">model — carried out in the visual register.</w:t>
       </w:r>
     </w:p>
-    <w:bookmarkEnd w:id="66"/>
-    <w:bookmarkStart w:id="68" w:name="X9a2cf50a766bb139ddffc9c7d5b965d495c5521"/>
+    <w:bookmarkEnd w:id="71"/>
+    <w:bookmarkStart w:id="73" w:name="X9a2cf50a766bb139ddffc9c7d5b965d495c5521"/>
     <w:p>
       <w:pPr>
         <w:pStyle w:val="Heading2"/>
@@ -4963,7 +5660,7 @@
       <w:r>
         <w:t xml:space="preserve"> </w:t>
       </w:r>
-      <w:hyperlink r:id="rId67">
+      <w:hyperlink r:id="rId72">
         <w:r>
           <w:rPr>
             <w:rStyle w:val="Hyperlink"/>
@@ -5003,8 +5700,8 @@
         <w:t xml:space="preserve">paper’s method made explicit: surfaces to see with, models to decide with.</w:t>
       </w:r>
     </w:p>
-    <w:bookmarkEnd w:id="68"/>
-    <w:bookmarkStart w:id="69" w:name="what-covid-did-and-did-not-do"/>
+    <w:bookmarkEnd w:id="73"/>
+    <w:bookmarkStart w:id="74" w:name="what-covid-did-and-did-not-do"/>
     <w:p>
       <w:pPr>
         <w:pStyle w:val="Heading2"/>
@@ -5081,9 +5778,9 @@
         <w:t xml:space="preserve">same discipline here.</w:t>
       </w:r>
     </w:p>
-    <w:bookmarkEnd w:id="69"/>
-    <w:bookmarkEnd w:id="70"/>
-    <w:bookmarkStart w:id="74" w:name="discussion"/>
+    <w:bookmarkEnd w:id="74"/>
+    <w:bookmarkEnd w:id="75"/>
+    <w:bookmarkStart w:id="79" w:name="discussion"/>
     <w:p>
       <w:pPr>
         <w:pStyle w:val="Heading1"/>
@@ -5092,7 +5789,7 @@
         <w:t xml:space="preserve">Discussion</w:t>
       </w:r>
     </w:p>
-    <w:bookmarkStart w:id="71" w:name="X11711047deb1d43f5bfa19d793e022a01c4cb7e"/>
+    <w:bookmarkStart w:id="76" w:name="X11711047deb1d43f5bfa19d793e022a01c4cb7e"/>
     <w:p>
       <w:pPr>
         <w:pStyle w:val="Heading2"/>
@@ -5145,19 +5842,40 @@
         <w:t xml:space="preserve">(Comolli et al. 2021; Hellstrand et al. 2020)</w:t>
       </w:r>
       <w:r>
-        <w:t xml:space="preserve">, and — the constraint this paper adds — why</w:t>
-      </w:r>
-      <w:r>
-        <w:t xml:space="preserve"> </w:t>
-      </w:r>
-      <w:r>
-        <w:t xml:space="preserve">the final departures from replacement, in country after country, occurred</w:t>
-      </w:r>
-      <w:r>
-        <w:t xml:space="preserve"> </w:t>
-      </w:r>
-      <w:r>
-        <w:t xml:space="preserve">pressed against a nearly fixed ceiling in the low forties. The ceiling also</w:t>
+        <w:t xml:space="preserve">, and — the constraints this paper adds —</w:t>
+      </w:r>
+      <w:r>
+        <w:t xml:space="preserve"> </w:t>
+      </w:r>
+      <w:r>
+        <w:t xml:space="preserve">why the final departures from replacement, in country after country,</w:t>
+      </w:r>
+      <w:r>
+        <w:t xml:space="preserve"> </w:t>
+      </w:r>
+      <w:r>
+        <w:t xml:space="preserve">occurred pressed against a nearly fixed ceiling in the low forties, and why</w:t>
+      </w:r>
+      <w:r>
+        <w:t xml:space="preserve"> </w:t>
+      </w:r>
+      <w:r>
+        <w:t xml:space="preserve">fertility schedules everywhere are converging on the same later, lower,</w:t>
+      </w:r>
+      <w:r>
+        <w:t xml:space="preserve"> </w:t>
+      </w:r>
+      <w:r>
+        <w:t xml:space="preserve">narrower shape even as total rates converge downward</w:t>
+      </w:r>
+      <w:r>
+        <w:t xml:space="preserve"> </w:t>
+      </w:r>
+      <w:r>
+        <w:t xml:space="preserve">(Ritchie 2026)</w:t>
+      </w:r>
+      <w:r>
+        <w:t xml:space="preserve">. The ceiling also</w:t>
       </w:r>
       <w:r>
         <w:t xml:space="preserve"> </w:t>
@@ -5190,8 +5908,8 @@
         <w:t xml:space="preserve">corridor is closing from below.</w:t>
       </w:r>
     </w:p>
-    <w:bookmarkEnd w:id="71"/>
-    <w:bookmarkStart w:id="72" w:name="limitations"/>
+    <w:bookmarkEnd w:id="76"/>
+    <w:bookmarkStart w:id="77" w:name="limitations"/>
     <w:p>
       <w:pPr>
         <w:pStyle w:val="Heading2"/>
@@ -5292,8 +6010,8 @@
         <w:t xml:space="preserve">for the universality question.</w:t>
       </w:r>
     </w:p>
-    <w:bookmarkEnd w:id="72"/>
-    <w:bookmarkStart w:id="73" w:name="X73f23dd9bd1f7fe61bfffcfbeb8c97340c4c204"/>
+    <w:bookmarkEnd w:id="77"/>
+    <w:bookmarkStart w:id="78" w:name="X73f23dd9bd1f7fe61bfffcfbeb8c97340c4c204"/>
     <w:p>
       <w:pPr>
         <w:pStyle w:val="Heading2"/>
@@ -5436,9 +6154,9 @@
         <w:t xml:space="preserve">its authors’ spare time.</w:t>
       </w:r>
     </w:p>
-    <w:bookmarkEnd w:id="73"/>
-    <w:bookmarkEnd w:id="74"/>
-    <w:bookmarkStart w:id="77" w:name="conclusions"/>
+    <w:bookmarkEnd w:id="78"/>
+    <w:bookmarkEnd w:id="79"/>
+    <w:bookmarkStart w:id="82" w:name="conclusions"/>
     <w:p>
       <w:pPr>
         <w:pStyle w:val="Heading1"/>
@@ -5580,12 +6298,12 @@
                 <wp:inline>
                   <wp:extent cx="152400" cy="152400"/>
                   <wp:effectExtent b="0" l="0" r="0" t="0"/>
-                  <wp:docPr descr="" title="" id="75" name="Picture"/>
+                  <wp:docPr descr="" title="" id="80" name="Picture"/>
                   <a:graphic>
                     <a:graphicData uri="http://schemas.openxmlformats.org/drawingml/2006/picture">
                       <pic:pic>
                         <pic:nvPicPr>
-                          <pic:cNvPr descr="/Applications/quarto/share/formats/docx/note.png" id="76" name="Picture"/>
+                          <pic:cNvPr descr="/Applications/quarto/share/formats/docx/note.png" id="81" name="Picture"/>
                           <pic:cNvPicPr>
                             <a:picLocks noChangeArrowheads="1" noChangeAspect="1"/>
                           </pic:cNvPicPr>
@@ -5695,7 +6413,7 @@
             <w:r>
               <w:t xml:space="preserve"> </w:t>
             </w:r>
-            <w:hyperlink r:id="rId67">
+            <w:hyperlink r:id="rId72">
               <w:r>
                 <w:rPr>
                   <w:rStyle w:val="Hyperlink"/>
@@ -5734,7 +6452,19 @@
               <w:t xml:space="preserve"> </w:t>
             </w:r>
             <w:r>
-              <w:t xml:space="preserve">this paper updates and for review comments on the working papers.</w:t>
+              <w:t xml:space="preserve">this paper updates and for review comments on the working papers and the</w:t>
+            </w:r>
+            <w:r>
+              <w:t xml:space="preserve"> </w:t>
+            </w:r>
+            <w:r>
+              <w:t xml:space="preserve">merged draft; the grandparental-care mechanism discussed in Results II was</w:t>
+            </w:r>
+            <w:r>
+              <w:t xml:space="preserve"> </w:t>
+            </w:r>
+            <w:r>
+              <w:t xml:space="preserve">suggested by Laura Vanderbloemen in review.</w:t>
             </w:r>
             <w:r>
               <w:t xml:space="preserve"> </w:t>
@@ -5744,8 +6474,8 @@
         </w:tc>
       </w:tr>
     </w:tbl>
-    <w:bookmarkEnd w:id="77"/>
-    <w:bookmarkStart w:id="122" w:name="references"/>
+    <w:bookmarkEnd w:id="82"/>
+    <w:bookmarkStart w:id="143" w:name="references"/>
     <w:p>
       <w:pPr>
         <w:pStyle w:val="Heading1"/>
@@ -5754,8 +6484,54 @@
         <w:t xml:space="preserve">References</w:t>
       </w:r>
     </w:p>
-    <w:bookmarkStart w:id="121" w:name="refs"/>
-    <w:bookmarkStart w:id="79" w:name="ref-beaujouan2020"/>
+    <w:bookmarkStart w:id="142" w:name="refs"/>
+    <w:bookmarkStart w:id="84" w:name="ref-aassve2012grandparenting"/>
+    <w:p>
+      <w:pPr>
+        <w:pStyle w:val="Bibliography"/>
+      </w:pPr>
+      <w:r>
+        <w:t xml:space="preserve">Aassve, Arnstein, Elena Meroni, and Chiara Pronzato. 2012.</w:t>
+      </w:r>
+      <w:r>
+        <w:t xml:space="preserve"> </w:t>
+      </w:r>
+      <w:r>
+        <w:t xml:space="preserve">“Grandparenting and Childbearing in the Extended Family.”</w:t>
+      </w:r>
+      <w:r>
+        <w:t xml:space="preserve"> </w:t>
+      </w:r>
+      <w:r>
+        <w:rPr>
+          <w:i/>
+          <w:iCs/>
+        </w:rPr>
+        <w:t xml:space="preserve">European Journal of Population</w:t>
+      </w:r>
+      <w:r>
+        <w:t xml:space="preserve"> </w:t>
+      </w:r>
+      <w:r>
+        <w:t xml:space="preserve">28 (4): 499–518.</w:t>
+      </w:r>
+      <w:r>
+        <w:t xml:space="preserve"> </w:t>
+      </w:r>
+      <w:hyperlink r:id="rId83">
+        <w:r>
+          <w:rPr>
+            <w:rStyle w:val="Hyperlink"/>
+          </w:rPr>
+          <w:t xml:space="preserve">https://doi.org/10.1007/s10680-012-9273-2</w:t>
+        </w:r>
+      </w:hyperlink>
+      <w:r>
+        <w:t xml:space="preserve">.</w:t>
+      </w:r>
+    </w:p>
+    <w:bookmarkEnd w:id="84"/>
+    <w:bookmarkStart w:id="86" w:name="ref-beaujouan2020"/>
     <w:p>
       <w:pPr>
         <w:pStyle w:val="Bibliography"/>
@@ -5788,7 +6564,7 @@
       <w:r>
         <w:t xml:space="preserve"> </w:t>
       </w:r>
-      <w:hyperlink r:id="rId78">
+      <w:hyperlink r:id="rId85">
         <w:r>
           <w:rPr>
             <w:rStyle w:val="Hyperlink"/>
@@ -5800,8 +6576,8 @@
         <w:t xml:space="preserve">.</w:t>
       </w:r>
     </w:p>
-    <w:bookmarkEnd w:id="79"/>
-    <w:bookmarkStart w:id="81" w:name="ref-billari2019broadband"/>
+    <w:bookmarkEnd w:id="86"/>
+    <w:bookmarkStart w:id="88" w:name="ref-billari2019broadband"/>
     <w:p>
       <w:pPr>
         <w:pStyle w:val="Bibliography"/>
@@ -5834,7 +6610,7 @@
       <w:r>
         <w:t xml:space="preserve"> </w:t>
       </w:r>
-      <w:hyperlink r:id="rId80">
+      <w:hyperlink r:id="rId87">
         <w:r>
           <w:rPr>
             <w:rStyle w:val="Hyperlink"/>
@@ -5846,8 +6622,8 @@
         <w:t xml:space="preserve">.</w:t>
       </w:r>
     </w:p>
-    <w:bookmarkEnd w:id="81"/>
-    <w:bookmarkStart w:id="83" w:name="ref-bongaartswatkins1996"/>
+    <w:bookmarkEnd w:id="88"/>
+    <w:bookmarkStart w:id="90" w:name="ref-bongaartswatkins1996"/>
     <w:p>
       <w:pPr>
         <w:pStyle w:val="Bibliography"/>
@@ -5880,7 +6656,7 @@
       <w:r>
         <w:t xml:space="preserve"> </w:t>
       </w:r>
-      <w:hyperlink r:id="rId82">
+      <w:hyperlink r:id="rId89">
         <w:r>
           <w:rPr>
             <w:rStyle w:val="Hyperlink"/>
@@ -5892,8 +6668,91 @@
         <w:t xml:space="preserve">.</w:t>
       </w:r>
     </w:p>
-    <w:bookmarkEnd w:id="83"/>
-    <w:bookmarkStart w:id="85" w:name="ref-casterline2001"/>
+    <w:bookmarkEnd w:id="90"/>
+    <w:bookmarkStart w:id="92" w:name="ref-burkimsher2017"/>
+    <w:p>
+      <w:pPr>
+        <w:pStyle w:val="Bibliography"/>
+      </w:pPr>
+      <w:r>
+        <w:t xml:space="preserve">Burkimsher, Marion. 2017.</w:t>
+      </w:r>
+      <w:r>
+        <w:t xml:space="preserve"> </w:t>
+      </w:r>
+      <w:r>
+        <w:t xml:space="preserve">“Evolution of the Shape of the Fertility Curve: Why Might Some Countries Develop a Bimodal Curve?”</w:t>
+      </w:r>
+      <w:r>
+        <w:t xml:space="preserve"> </w:t>
+      </w:r>
+      <w:r>
+        <w:rPr>
+          <w:i/>
+          <w:iCs/>
+        </w:rPr>
+        <w:t xml:space="preserve">Demographic Research</w:t>
+      </w:r>
+      <w:r>
+        <w:t xml:space="preserve"> </w:t>
+      </w:r>
+      <w:r>
+        <w:t xml:space="preserve">37 (11): 295–324.</w:t>
+      </w:r>
+      <w:r>
+        <w:t xml:space="preserve"> </w:t>
+      </w:r>
+      <w:hyperlink r:id="rId91">
+        <w:r>
+          <w:rPr>
+            <w:rStyle w:val="Hyperlink"/>
+          </w:rPr>
+          <w:t xml:space="preserve">https://doi.org/10.4054/DemRes.2017.37.11</w:t>
+        </w:r>
+      </w:hyperlink>
+      <w:r>
+        <w:t xml:space="preserve">.</w:t>
+      </w:r>
+    </w:p>
+    <w:bookmarkEnd w:id="92"/>
+    <w:bookmarkStart w:id="94" w:name="ref-burnmurdoch2026phones"/>
+    <w:p>
+      <w:pPr>
+        <w:pStyle w:val="Bibliography"/>
+      </w:pPr>
+      <w:r>
+        <w:t xml:space="preserve">Burn-Murdoch, John. 2026.</w:t>
+      </w:r>
+      <w:r>
+        <w:t xml:space="preserve"> </w:t>
+      </w:r>
+      <w:r>
+        <w:rPr>
+          <w:i/>
+          <w:iCs/>
+        </w:rPr>
+        <w:t xml:space="preserve">[Smartphones, Social Media and the Global Decline in Birth Rates]</w:t>
+      </w:r>
+      <w:r>
+        <w:t xml:space="preserve">. Financial Times, data column (mid-May 2026).</w:t>
+      </w:r>
+      <w:r>
+        <w:t xml:space="preserve"> </w:t>
+      </w:r>
+      <w:hyperlink r:id="rId93">
+        <w:r>
+          <w:rPr>
+            <w:rStyle w:val="Hyperlink"/>
+          </w:rPr>
+          <w:t xml:space="preserve">https://www.ft.com/content/fba35eca-df3a-4ad6-b42d-eb08eb7c9ad3</w:t>
+        </w:r>
+      </w:hyperlink>
+      <w:r>
+        <w:t xml:space="preserve">.</w:t>
+      </w:r>
+    </w:p>
+    <w:bookmarkEnd w:id="94"/>
+    <w:bookmarkStart w:id="96" w:name="ref-casterline2001"/>
     <w:p>
       <w:pPr>
         <w:pStyle w:val="Bibliography"/>
@@ -5917,7 +6776,7 @@
       <w:r>
         <w:t xml:space="preserve"> </w:t>
       </w:r>
-      <w:hyperlink r:id="rId84">
+      <w:hyperlink r:id="rId95">
         <w:r>
           <w:rPr>
             <w:rStyle w:val="Hyperlink"/>
@@ -5929,8 +6788,8 @@
         <w:t xml:space="preserve">.</w:t>
       </w:r>
     </w:p>
-    <w:bookmarkEnd w:id="85"/>
-    <w:bookmarkStart w:id="87" w:name="ref-comolli2021"/>
+    <w:bookmarkEnd w:id="96"/>
+    <w:bookmarkStart w:id="98" w:name="ref-comolli2021"/>
     <w:p>
       <w:pPr>
         <w:pStyle w:val="Bibliography"/>
@@ -5975,7 +6834,7 @@
       <w:r>
         <w:t xml:space="preserve"> </w:t>
       </w:r>
-      <w:hyperlink r:id="rId86">
+      <w:hyperlink r:id="rId97">
         <w:r>
           <w:rPr>
             <w:rStyle w:val="Hyperlink"/>
@@ -5987,8 +6846,66 @@
         <w:t xml:space="preserve">.</w:t>
       </w:r>
     </w:p>
-    <w:bookmarkEnd w:id="87"/>
-    <w:bookmarkStart w:id="88" w:name="ref-garnier2018"/>
+    <w:bookmarkEnd w:id="98"/>
+    <w:bookmarkStart w:id="100" w:name="ref-dorius2008"/>
+    <w:p>
+      <w:pPr>
+        <w:pStyle w:val="Bibliography"/>
+      </w:pPr>
+      <w:r>
+        <w:t xml:space="preserve">Dorius, Shawn F. 2008.</w:t>
+      </w:r>
+      <w:r>
+        <w:t xml:space="preserve"> </w:t>
+      </w:r>
+      <w:r>
+        <w:t xml:space="preserve">“Global Demographic Convergence?</w:t>
+      </w:r>
+      <w:r>
+        <w:t xml:space="preserve"> </w:t>
+      </w:r>
+      <w:r>
+        <w:t xml:space="preserve">A</w:t>
+      </w:r>
+      <w:r>
+        <w:t xml:space="preserve"> </w:t>
+      </w:r>
+      <w:r>
+        <w:t xml:space="preserve">Reconsideration of Changing Intercountry Inequality in Fertility.”</w:t>
+      </w:r>
+      <w:r>
+        <w:t xml:space="preserve"> </w:t>
+      </w:r>
+      <w:r>
+        <w:rPr>
+          <w:i/>
+          <w:iCs/>
+        </w:rPr>
+        <w:t xml:space="preserve">Population and Development Review</w:t>
+      </w:r>
+      <w:r>
+        <w:t xml:space="preserve"> </w:t>
+      </w:r>
+      <w:r>
+        <w:t xml:space="preserve">34 (3): 519–37.</w:t>
+      </w:r>
+      <w:r>
+        <w:t xml:space="preserve"> </w:t>
+      </w:r>
+      <w:hyperlink r:id="rId99">
+        <w:r>
+          <w:rPr>
+            <w:rStyle w:val="Hyperlink"/>
+          </w:rPr>
+          <w:t xml:space="preserve">https://doi.org/10.1111/j.1728-4457.2008.00235.x</w:t>
+        </w:r>
+      </w:hyperlink>
+      <w:r>
+        <w:t xml:space="preserve">.</w:t>
+      </w:r>
+    </w:p>
+    <w:bookmarkEnd w:id="100"/>
+    <w:bookmarkStart w:id="101" w:name="ref-garnier2018"/>
     <w:p>
       <w:pPr>
         <w:pStyle w:val="Bibliography"/>
@@ -6024,8 +6941,8 @@
         <w:t xml:space="preserve">.</w:t>
       </w:r>
     </w:p>
-    <w:bookmarkEnd w:id="88"/>
-    <w:bookmarkStart w:id="89" w:name="ref-goldstein2009"/>
+    <w:bookmarkEnd w:id="101"/>
+    <w:bookmarkStart w:id="102" w:name="ref-goldstein2009"/>
     <w:p>
       <w:pPr>
         <w:pStyle w:val="Bibliography"/>
@@ -6068,8 +6985,8 @@
         <w:t xml:space="preserve">35 (4): 663–99.</w:t>
       </w:r>
     </w:p>
-    <w:bookmarkEnd w:id="89"/>
-    <w:bookmarkStart w:id="91" w:name="ref-guldi2017"/>
+    <w:bookmarkEnd w:id="102"/>
+    <w:bookmarkStart w:id="104" w:name="ref-guldi2017"/>
     <w:p>
       <w:pPr>
         <w:pStyle w:val="Bibliography"/>
@@ -6102,7 +7019,7 @@
       <w:r>
         <w:t xml:space="preserve"> </w:t>
       </w:r>
-      <w:hyperlink r:id="rId90">
+      <w:hyperlink r:id="rId103">
         <w:r>
           <w:rPr>
             <w:rStyle w:val="Hyperlink"/>
@@ -6114,8 +7031,54 @@
         <w:t xml:space="preserve">.</w:t>
       </w:r>
     </w:p>
-    <w:bookmarkEnd w:id="91"/>
-    <w:bookmarkStart w:id="93" w:name="ref-hellstrand2020"/>
+    <w:bookmarkEnd w:id="104"/>
+    <w:bookmarkStart w:id="106" w:name="ref-hawkes1998"/>
+    <w:p>
+      <w:pPr>
+        <w:pStyle w:val="Bibliography"/>
+      </w:pPr>
+      <w:r>
+        <w:t xml:space="preserve">Hawkes, Kristen, James F. O’Connell, Nicholas G. Blurton Jones, Helen Alvarez, and Eric L. Charnov. 1998.</w:t>
+      </w:r>
+      <w:r>
+        <w:t xml:space="preserve"> </w:t>
+      </w:r>
+      <w:r>
+        <w:t xml:space="preserve">“Grandmothering, Menopause, and the Evolution of Human Life Histories.”</w:t>
+      </w:r>
+      <w:r>
+        <w:t xml:space="preserve"> </w:t>
+      </w:r>
+      <w:r>
+        <w:rPr>
+          <w:i/>
+          <w:iCs/>
+        </w:rPr>
+        <w:t xml:space="preserve">Proceedings of the National Academy of Sciences</w:t>
+      </w:r>
+      <w:r>
+        <w:t xml:space="preserve"> </w:t>
+      </w:r>
+      <w:r>
+        <w:t xml:space="preserve">95 (3): 1336–39.</w:t>
+      </w:r>
+      <w:r>
+        <w:t xml:space="preserve"> </w:t>
+      </w:r>
+      <w:hyperlink r:id="rId105">
+        <w:r>
+          <w:rPr>
+            <w:rStyle w:val="Hyperlink"/>
+          </w:rPr>
+          <w:t xml:space="preserve">https://doi.org/10.1073/pnas.95.3.1336</w:t>
+        </w:r>
+      </w:hyperlink>
+      <w:r>
+        <w:t xml:space="preserve">.</w:t>
+      </w:r>
+    </w:p>
+    <w:bookmarkEnd w:id="106"/>
+    <w:bookmarkStart w:id="108" w:name="ref-hellstrand2020"/>
     <w:p>
       <w:pPr>
         <w:pStyle w:val="Bibliography"/>
@@ -6157,7 +7120,7 @@
       <w:r>
         <w:t xml:space="preserve"> </w:t>
       </w:r>
-      <w:hyperlink r:id="rId92">
+      <w:hyperlink r:id="rId107">
         <w:r>
           <w:rPr>
             <w:rStyle w:val="Hyperlink"/>
@@ -6169,8 +7132,8 @@
         <w:t xml:space="preserve">.</w:t>
       </w:r>
     </w:p>
-    <w:bookmarkEnd w:id="93"/>
-    <w:bookmarkStart w:id="94" w:name="ref-hudson2026teen"/>
+    <w:bookmarkEnd w:id="108"/>
+    <w:bookmarkStart w:id="109" w:name="ref-hudson2026teen"/>
     <w:p>
       <w:pPr>
         <w:pStyle w:val="Bibliography"/>
@@ -6191,8 +7154,8 @@
         <w:t xml:space="preserve">Unpublished manuscript.</w:t>
       </w:r>
     </w:p>
-    <w:bookmarkEnd w:id="94"/>
-    <w:bookmarkStart w:id="95" w:name="ref-jaeger2020"/>
+    <w:bookmarkEnd w:id="109"/>
+    <w:bookmarkStart w:id="110" w:name="ref-jaeger2020"/>
     <w:p>
       <w:pPr>
         <w:pStyle w:val="Bibliography"/>
@@ -6235,8 +7198,8 @@
         <w:t xml:space="preserve">38 (2): 317–26.</w:t>
       </w:r>
     </w:p>
-    <w:bookmarkEnd w:id="95"/>
-    <w:bookmarkStart w:id="97" w:name="ref-kearney2015media"/>
+    <w:bookmarkEnd w:id="110"/>
+    <w:bookmarkStart w:id="112" w:name="ref-kearney2015media"/>
     <w:p>
       <w:pPr>
         <w:pStyle w:val="Bibliography"/>
@@ -6278,7 +7241,7 @@
       <w:r>
         <w:t xml:space="preserve"> </w:t>
       </w:r>
-      <w:hyperlink r:id="rId96">
+      <w:hyperlink r:id="rId111">
         <w:r>
           <w:rPr>
             <w:rStyle w:val="Hyperlink"/>
@@ -6290,8 +7253,8 @@
         <w:t xml:space="preserve">.</w:t>
       </w:r>
     </w:p>
-    <w:bookmarkEnd w:id="97"/>
-    <w:bookmarkStart w:id="99" w:name="ref-kearney2022"/>
+    <w:bookmarkEnd w:id="112"/>
+    <w:bookmarkStart w:id="114" w:name="ref-kearney2022"/>
     <w:p>
       <w:pPr>
         <w:pStyle w:val="Bibliography"/>
@@ -6333,7 +7296,7 @@
       <w:r>
         <w:t xml:space="preserve"> </w:t>
       </w:r>
-      <w:hyperlink r:id="rId98">
+      <w:hyperlink r:id="rId113">
         <w:r>
           <w:rPr>
             <w:rStyle w:val="Hyperlink"/>
@@ -6345,8 +7308,8 @@
         <w:t xml:space="preserve">.</w:t>
       </w:r>
     </w:p>
-    <w:bookmarkEnd w:id="99"/>
-    <w:bookmarkStart w:id="100" w:name="ref-kravdal2016"/>
+    <w:bookmarkEnd w:id="114"/>
+    <w:bookmarkStart w:id="115" w:name="ref-kravdal2016"/>
     <w:p>
       <w:pPr>
         <w:pStyle w:val="Bibliography"/>
@@ -6389,8 +7352,8 @@
         <w:t xml:space="preserve">, edited by Ronald R. Rindfuss and Minja Kim Choe. Springer.</w:t>
       </w:r>
     </w:p>
-    <w:bookmarkEnd w:id="100"/>
-    <w:bookmarkStart w:id="102" w:name="ref-hfc2026"/>
+    <w:bookmarkEnd w:id="115"/>
+    <w:bookmarkStart w:id="117" w:name="ref-hfc2026"/>
     <w:p>
       <w:pPr>
         <w:pStyle w:val="Bibliography"/>
@@ -6428,7 +7391,7 @@
       <w:r>
         <w:t xml:space="preserve"> </w:t>
       </w:r>
-      <w:hyperlink r:id="rId101">
+      <w:hyperlink r:id="rId116">
         <w:r>
           <w:rPr>
             <w:rStyle w:val="Hyperlink"/>
@@ -6440,8 +7403,8 @@
         <w:t xml:space="preserve">.</w:t>
       </w:r>
     </w:p>
-    <w:bookmarkEnd w:id="102"/>
-    <w:bookmarkStart w:id="104" w:name="ref-hfd2026"/>
+    <w:bookmarkEnd w:id="117"/>
+    <w:bookmarkStart w:id="119" w:name="ref-hfd2026"/>
     <w:p>
       <w:pPr>
         <w:pStyle w:val="Bibliography"/>
@@ -6479,7 +7442,7 @@
       <w:r>
         <w:t xml:space="preserve"> </w:t>
       </w:r>
-      <w:hyperlink r:id="rId103">
+      <w:hyperlink r:id="rId118">
         <w:r>
           <w:rPr>
             <w:rStyle w:val="Hyperlink"/>
@@ -6491,8 +7454,8 @@
         <w:t xml:space="preserve">.</w:t>
       </w:r>
     </w:p>
-    <w:bookmarkEnd w:id="104"/>
-    <w:bookmarkStart w:id="105" w:name="ref-moscoso2026wide"/>
+    <w:bookmarkEnd w:id="119"/>
+    <w:bookmarkStart w:id="120" w:name="ref-moscoso2026wide"/>
     <w:p>
       <w:pPr>
         <w:pStyle w:val="Bibliography"/>
@@ -6513,8 +7476,8 @@
         <w:t xml:space="preserve">Unpublished manuscript.</w:t>
       </w:r>
     </w:p>
-    <w:bookmarkEnd w:id="105"/>
-    <w:bookmarkStart w:id="106" w:name="ref-myers2026iphone"/>
+    <w:bookmarkEnd w:id="120"/>
+    <w:bookmarkStart w:id="121" w:name="ref-myers2026iphone"/>
     <w:p>
       <w:pPr>
         <w:pStyle w:val="Bibliography"/>
@@ -6568,8 +7531,8 @@
         <w:t xml:space="preserve">Unpublished manuscript.</w:t>
       </w:r>
     </w:p>
-    <w:bookmarkEnd w:id="106"/>
-    <w:bookmarkStart w:id="107" w:name="ref-myrskyla2013"/>
+    <w:bookmarkEnd w:id="121"/>
+    <w:bookmarkStart w:id="122" w:name="ref-myrskyla2013"/>
     <w:p>
       <w:pPr>
         <w:pStyle w:val="Bibliography"/>
@@ -6600,8 +7563,8 @@
         <w:t xml:space="preserve">39 (1): 31–56.</w:t>
       </w:r>
     </w:p>
-    <w:bookmarkEnd w:id="107"/>
-    <w:bookmarkStart w:id="109" w:name="ref-pattaro2020"/>
+    <w:bookmarkEnd w:id="122"/>
+    <w:bookmarkStart w:id="124" w:name="ref-pattaro2020"/>
     <w:p>
       <w:pPr>
         <w:pStyle w:val="Bibliography"/>
@@ -6634,7 +7597,7 @@
       <w:r>
         <w:t xml:space="preserve"> </w:t>
       </w:r>
-      <w:hyperlink r:id="rId108">
+      <w:hyperlink r:id="rId123">
         <w:r>
           <w:rPr>
             <w:rStyle w:val="Hyperlink"/>
@@ -6646,8 +7609,45 @@
         <w:t xml:space="preserve">.</w:t>
       </w:r>
     </w:p>
-    <w:bookmarkEnd w:id="109"/>
-    <w:bookmarkStart w:id="111" w:name="ref-roserobixby1993"/>
+    <w:bookmarkEnd w:id="124"/>
+    <w:bookmarkStart w:id="126" w:name="ref-ritchie2026convergence"/>
+    <w:p>
+      <w:pPr>
+        <w:pStyle w:val="Bibliography"/>
+      </w:pPr>
+      <w:r>
+        <w:t xml:space="preserve">Ritchie, Hannah. 2026.</w:t>
+      </w:r>
+      <w:r>
+        <w:t xml:space="preserve"> </w:t>
+      </w:r>
+      <w:r>
+        <w:rPr>
+          <w:i/>
+          <w:iCs/>
+        </w:rPr>
+        <w:t xml:space="preserve">Fertility Rates Across Many Countries Have Converged, Despite Starting from Very Different Levels</w:t>
+      </w:r>
+      <w:r>
+        <w:t xml:space="preserve">. Our World in Data, Data Insights (16 July 2026).</w:t>
+      </w:r>
+      <w:r>
+        <w:t xml:space="preserve"> </w:t>
+      </w:r>
+      <w:hyperlink r:id="rId125">
+        <w:r>
+          <w:rPr>
+            <w:rStyle w:val="Hyperlink"/>
+          </w:rPr>
+          <w:t xml:space="preserve">https://ourworldindata.org/data-insights/fertility-rates-across-many-countries-have-converged-despite-starting-from-very-different-levels</w:t>
+        </w:r>
+      </w:hyperlink>
+      <w:r>
+        <w:t xml:space="preserve">.</w:t>
+      </w:r>
+    </w:p>
+    <w:bookmarkEnd w:id="126"/>
+    <w:bookmarkStart w:id="128" w:name="ref-roserobixby1993"/>
     <w:p>
       <w:pPr>
         <w:pStyle w:val="Bibliography"/>
@@ -6680,7 +7680,7 @@
       <w:r>
         <w:t xml:space="preserve"> </w:t>
       </w:r>
-      <w:hyperlink r:id="rId110">
+      <w:hyperlink r:id="rId127">
         <w:r>
           <w:rPr>
             <w:rStyle w:val="Hyperlink"/>
@@ -6692,8 +7692,8 @@
         <w:t xml:space="preserve">.</w:t>
       </w:r>
     </w:p>
-    <w:bookmarkEnd w:id="111"/>
-    <w:bookmarkStart w:id="113" w:name="ref-rotondi2020"/>
+    <w:bookmarkEnd w:id="128"/>
+    <w:bookmarkStart w:id="130" w:name="ref-rotondi2020"/>
     <w:p>
       <w:pPr>
         <w:pStyle w:val="Bibliography"/>
@@ -6726,7 +7726,7 @@
       <w:r>
         <w:t xml:space="preserve"> </w:t>
       </w:r>
-      <w:hyperlink r:id="rId112">
+      <w:hyperlink r:id="rId129">
         <w:r>
           <w:rPr>
             <w:rStyle w:val="Hyperlink"/>
@@ -6738,8 +7738,8 @@
         <w:t xml:space="preserve">.</w:t>
       </w:r>
     </w:p>
-    <w:bookmarkEnd w:id="113"/>
-    <w:bookmarkStart w:id="114" w:name="ref-sarkar2008"/>
+    <w:bookmarkEnd w:id="130"/>
+    <w:bookmarkStart w:id="131" w:name="ref-sarkar2008"/>
     <w:p>
       <w:pPr>
         <w:pStyle w:val="Bibliography"/>
@@ -6761,8 +7761,8 @@
         <w:t xml:space="preserve">. Use r! Springer.</w:t>
       </w:r>
     </w:p>
-    <w:bookmarkEnd w:id="114"/>
-    <w:bookmarkStart w:id="115" w:name="ref-sobotka2017"/>
+    <w:bookmarkEnd w:id="131"/>
+    <w:bookmarkStart w:id="132" w:name="ref-sobotka2017"/>
     <w:p>
       <w:pPr>
         <w:pStyle w:val="Bibliography"/>
@@ -6793,8 +7793,8 @@
         <w:t xml:space="preserve">49 (S1): S20–45.</w:t>
       </w:r>
     </w:p>
-    <w:bookmarkEnd w:id="115"/>
-    <w:bookmarkStart w:id="116" w:name="ref-sobotka2011"/>
+    <w:bookmarkEnd w:id="132"/>
+    <w:bookmarkStart w:id="133" w:name="ref-sobotka2011"/>
     <w:p>
       <w:pPr>
         <w:pStyle w:val="Bibliography"/>
@@ -6825,29 +7825,32 @@
         <w:t xml:space="preserve">37 (2): 267–306.</w:t>
       </w:r>
     </w:p>
-    <w:bookmarkEnd w:id="116"/>
-    <w:bookmarkStart w:id="118" w:name="ref-yoo2018"/>
+    <w:bookmarkEnd w:id="133"/>
+    <w:bookmarkStart w:id="135" w:name="ref-tanskanen2014grandparental"/>
     <w:p>
       <w:pPr>
         <w:pStyle w:val="Bibliography"/>
       </w:pPr>
       <w:r>
-        <w:t xml:space="preserve">Yoo, Sam Hyun, and Tomáš Sobotka. 2018.</w:t>
-      </w:r>
-      <w:r>
-        <w:t xml:space="preserve"> </w:t>
-      </w:r>
-      <w:r>
-        <w:t xml:space="preserve">“Ultra-Low Fertility in</w:t>
-      </w:r>
-      <w:r>
-        <w:t xml:space="preserve"> </w:t>
-      </w:r>
-      <w:r>
-        <w:t xml:space="preserve">South Korea</w:t>
-      </w:r>
-      <w:r>
-        <w:t xml:space="preserve">: The Role of the Tempo Effect.”</w:t>
+        <w:t xml:space="preserve">Tanskanen, Antti O., and Anna Rotkirch. 2014.</w:t>
+      </w:r>
+      <w:r>
+        <w:t xml:space="preserve"> </w:t>
+      </w:r>
+      <w:r>
+        <w:t xml:space="preserve">“The Impact of Grandparental Investment on Mothers’ Fertility Intentions in Four</w:t>
+      </w:r>
+      <w:r>
+        <w:t xml:space="preserve"> </w:t>
+      </w:r>
+      <w:r>
+        <w:t xml:space="preserve">European</w:t>
+      </w:r>
+      <w:r>
+        <w:t xml:space="preserve"> </w:t>
+      </w:r>
+      <w:r>
+        <w:t xml:space="preserve">Countries.”</w:t>
       </w:r>
       <w:r>
         <w:t xml:space="preserve"> </w:t>
@@ -6863,12 +7866,113 @@
         <w:t xml:space="preserve"> </w:t>
       </w:r>
       <w:r>
+        <w:t xml:space="preserve">31 (1): 1–26.</w:t>
+      </w:r>
+      <w:r>
+        <w:t xml:space="preserve"> </w:t>
+      </w:r>
+      <w:hyperlink r:id="rId134">
+        <w:r>
+          <w:rPr>
+            <w:rStyle w:val="Hyperlink"/>
+          </w:rPr>
+          <w:t xml:space="preserve">https://doi.org/10.4054/DemRes.2014.31.1</w:t>
+        </w:r>
+      </w:hyperlink>
+      <w:r>
+        <w:t xml:space="preserve">.</w:t>
+      </w:r>
+    </w:p>
+    <w:bookmarkEnd w:id="135"/>
+    <w:bookmarkStart w:id="137" w:name="ref-wilson2001"/>
+    <w:p>
+      <w:pPr>
+        <w:pStyle w:val="Bibliography"/>
+      </w:pPr>
+      <w:r>
+        <w:t xml:space="preserve">Wilson, Chris. 2001.</w:t>
+      </w:r>
+      <w:r>
+        <w:t xml:space="preserve"> </w:t>
+      </w:r>
+      <w:r>
+        <w:t xml:space="preserve">“On the Scale of Global Demographic Convergence 1950–2000.”</w:t>
+      </w:r>
+      <w:r>
+        <w:t xml:space="preserve"> </w:t>
+      </w:r>
+      <w:r>
+        <w:rPr>
+          <w:i/>
+          <w:iCs/>
+        </w:rPr>
+        <w:t xml:space="preserve">Population and Development Review</w:t>
+      </w:r>
+      <w:r>
+        <w:t xml:space="preserve"> </w:t>
+      </w:r>
+      <w:r>
+        <w:t xml:space="preserve">27 (1): 155–71.</w:t>
+      </w:r>
+      <w:r>
+        <w:t xml:space="preserve"> </w:t>
+      </w:r>
+      <w:hyperlink r:id="rId136">
+        <w:r>
+          <w:rPr>
+            <w:rStyle w:val="Hyperlink"/>
+          </w:rPr>
+          <w:t xml:space="preserve">https://doi.org/10.1111/j.1728-4457.2001.00155.x</w:t>
+        </w:r>
+      </w:hyperlink>
+      <w:r>
+        <w:t xml:space="preserve">.</w:t>
+      </w:r>
+    </w:p>
+    <w:bookmarkEnd w:id="137"/>
+    <w:bookmarkStart w:id="139" w:name="ref-yoo2018"/>
+    <w:p>
+      <w:pPr>
+        <w:pStyle w:val="Bibliography"/>
+      </w:pPr>
+      <w:r>
+        <w:t xml:space="preserve">Yoo, Sam Hyun, and Tomáš Sobotka. 2018.</w:t>
+      </w:r>
+      <w:r>
+        <w:t xml:space="preserve"> </w:t>
+      </w:r>
+      <w:r>
+        <w:t xml:space="preserve">“Ultra-Low Fertility in</w:t>
+      </w:r>
+      <w:r>
+        <w:t xml:space="preserve"> </w:t>
+      </w:r>
+      <w:r>
+        <w:t xml:space="preserve">South Korea</w:t>
+      </w:r>
+      <w:r>
+        <w:t xml:space="preserve">: The Role of the Tempo Effect.”</w:t>
+      </w:r>
+      <w:r>
+        <w:t xml:space="preserve"> </w:t>
+      </w:r>
+      <w:r>
+        <w:rPr>
+          <w:i/>
+          <w:iCs/>
+        </w:rPr>
+        <w:t xml:space="preserve">Demographic Research</w:t>
+      </w:r>
+      <w:r>
+        <w:t xml:space="preserve"> </w:t>
+      </w:r>
+      <w:r>
         <w:t xml:space="preserve">38 (22): 549–76.</w:t>
       </w:r>
       <w:r>
         <w:t xml:space="preserve"> </w:t>
       </w:r>
-      <w:hyperlink r:id="rId117">
+      <w:hyperlink r:id="rId138">
         <w:r>
           <w:rPr>
             <w:rStyle w:val="Hyperlink"/>
@@ -6880,8 +7984,8 @@
         <w:t xml:space="preserve">.</w:t>
       </w:r>
     </w:p>
-    <w:bookmarkEnd w:id="118"/>
-    <w:bookmarkStart w:id="120" w:name="ref-zeman2018"/>
+    <w:bookmarkEnd w:id="139"/>
+    <w:bookmarkStart w:id="141" w:name="ref-zeman2018"/>
     <w:p>
       <w:pPr>
         <w:pStyle w:val="Bibliography"/>
@@ -6914,7 +8018,7 @@
       <w:r>
         <w:t xml:space="preserve"> </w:t>
       </w:r>
-      <w:hyperlink r:id="rId119">
+      <w:hyperlink r:id="rId140">
         <w:r>
           <w:rPr>
             <w:rStyle w:val="Hyperlink"/>
@@ -6926,9 +8030,9 @@
         <w:t xml:space="preserve">.</w:t>
       </w:r>
     </w:p>
-    <w:bookmarkEnd w:id="120"/>
-    <w:bookmarkEnd w:id="121"/>
-    <w:bookmarkEnd w:id="122"/>
+    <w:bookmarkEnd w:id="141"/>
+    <w:bookmarkEnd w:id="142"/>
+    <w:bookmarkEnd w:id="143"/>
     <w:sectPr>
       <w:footnotePr>
         <w:numRestart w:val="eachSect"/>
@@ -7691,6 +8795,11 @@
     <w:unhideWhenUsed/>
     <w:qFormat/>
     <w:tblPr>
+      <w:tblBorders>
+        <w:top w:color="666666" w:space="0" w:sz="4" w:val="single"/>
+        <w:bottom w:color="666666" w:space="0" w:sz="4" w:val="single"/>
+        <w:insideH w:color="666666" w:space="0" w:sz="4" w:val="single"/>
+      </w:tblBorders>
       <w:tblInd w:type="dxa" w:w="0"/>
       <w:tblCellMar>
         <w:top w:type="dxa" w:w="0"/>

</xml_diff>

<commit_message>
fix: 2x2 field contours + digitized 2018 extrapolations; 3x2 terrain/AAPF figure (F-028)
- CPCFR milestones as true field contours: vertical escapes to infinity
  where cohorts stop reaching replacement in observed data; censored
  contours end at the data edge (USA verdict stays open).
- Extrapolation lines digitized programmatically from the 2018 working
  figure (pixel extraction + tick calibration + QC overlay); shown on the
  2020-vintage panels only. True Norway line holds ~43 until ~1981 before
  turning vertical: realized escape came a decade of cohorts sooner than
  drawn - scoreboard and prose corrected.
- 3D figure redesigned per Jon: France/Norway/South Korea 3x2, theta +30,
  phi 42 (more overhead for 3D-to-2D correspondence), AAPF ridge as
  coloured peak cells beside each country's AAPF trajectory chart.

Co-Authored-By: Claude Fable 5 <noreply@anthropic.com>
</commit_message>
<xml_diff>
--- a/manuscript_2026/closing_corridor_merged.docx
+++ b/manuscript_2026/closing_corridor_merged.docx
@@ -927,19 +927,19 @@
         <w:t xml:space="preserve"> </w:t>
       </w:r>
       <w:r>
-        <w:t xml:space="preserve">with height carried by shading; the crest line of the terrain - the age at</w:t>
-      </w:r>
-      <w:r>
-        <w:t xml:space="preserve"> </w:t>
-      </w:r>
-      <w:r>
-        <w:t xml:space="preserve">which each year’s schedule peaks, and the rate at that peak - is a feature</w:t>
-      </w:r>
-      <w:r>
-        <w:t xml:space="preserve"> </w:t>
-      </w:r>
-      <w:r>
-        <w:t xml:space="preserve">we will return to and name in Section 3.</w:t>
+        <w:t xml:space="preserve">with height carried by shading; the terrain’s crest - the cells where each</w:t>
+      </w:r>
+      <w:r>
+        <w:t xml:space="preserve"> </w:t>
+      </w:r>
+      <w:r>
+        <w:t xml:space="preserve">year’s schedule peaks, and the rate in those cells - is a feature we will</w:t>
+      </w:r>
+      <w:r>
+        <w:t xml:space="preserve"> </w:t>
+      </w:r>
+      <w:r>
+        <w:t xml:space="preserve">return to and name in Section 3.</w:t>
       </w:r>
     </w:p>
     <w:tbl>
@@ -964,14 +964,14 @@
             <w:r>
               <w:drawing>
                 <wp:inline>
-                  <wp:extent cx="5334000" cy="3777465"/>
+                  <wp:extent cx="5334000" cy="6668441"/>
                   <wp:effectExtent b="0" l="0" r="0" t="0"/>
                   <wp:docPr descr="" title="" id="16" name="Picture"/>
                   <a:graphic>
                     <a:graphicData uri="http://schemas.openxmlformats.org/drawingml/2006/picture">
                       <pic:pic>
                         <pic:nvPicPr>
-                          <pic:cNvPr descr="figures/lexis3d_ridge_norway.png" id="17" name="Picture"/>
+                          <pic:cNvPr descr="figures/lexis3d_aapf_panels.png" id="17" name="Picture"/>
                           <pic:cNvPicPr>
                             <a:picLocks noChangeArrowheads="1" noChangeAspect="1"/>
                           </pic:cNvPicPr>
@@ -985,7 +985,7 @@
                         <pic:spPr bwMode="auto">
                           <a:xfrm>
                             <a:off x="0" y="0"/>
-                            <a:ext cx="5334000" cy="3777465"/>
+                            <a:ext cx="5334000" cy="6668441"/>
                           </a:xfrm>
                           <a:prstGeom prst="rect">
                             <a:avLst/>
@@ -1014,7 +1014,7 @@
               <w:pStyle w:val="ImageCaption"/>
             </w:pPr>
             <w:r>
-              <w:t xml:space="preserve">Figure 1: The fertility surface as terrain: Norway, 1950-2024. The height of the surface at each year and age is the ASFR; shading matches the lattice plots used throughout (darker is higher). The magenta crest line is the AAPF ridge - the age and amount of peak fertility - formalized in Section 3. The composite lattice plots read this terrain from above. (Norway is used as the example because its schedules have a clean single peak; see Supplement S8 for the United States’ historically flat-topped profile.)</w:t>
+              <w:t xml:space="preserve">Figure 1: The fertility surface as terrain, viewed from high above so that the correspondence with the fully overhead lattice plots is direct: France, Norway, and South Korea, 1950-2024 (South Korea from 1960). Left column: the ASFR terrain, shading matching the lattice plots (darker is higher); the cells forming the crest of each year’s schedule are coloured magenta - these cells are the AAPF, the age and amount of peak fertility, formalized in Section 3. (Magenta rather than dark purple, because the shading scale itself ends in dark purple exactly where the ridge sits.) Right column: the AAPF trajectory each surface distils to - the age of the magenta cells over time, shaded by the rate in them. The United States is not used as an example because its historically flat-topped schedules make the ridge ill-defined (Supplement S8).</w:t>
             </w:r>
           </w:p>
           <w:bookmarkEnd w:id="18"/>
@@ -2845,13 +2845,19 @@
         <w:t xml:space="preserve">“speculative extrapolation of replacement contour”</w:t>
       </w:r>
       <w:r>
-        <w:t xml:space="preserve">: climbing steeply for</w:t>
-      </w:r>
-      <w:r>
-        <w:t xml:space="preserve"> </w:t>
-      </w:r>
-      <w:r>
-        <w:t xml:space="preserve">Norway, continuing near-flat at age 37 for the United States. The drawn</w:t>
+        <w:t xml:space="preserve">: for Norway holding</w:t>
+      </w:r>
+      <w:r>
+        <w:t xml:space="preserve"> </w:t>
+      </w:r>
+      <w:r>
+        <w:t xml:space="preserve">near age 43 for a further decade of cohorts before turning vertical; for</w:t>
+      </w:r>
+      <w:r>
+        <w:t xml:space="preserve"> </w:t>
+      </w:r>
+      <w:r>
+        <w:t xml:space="preserve">the United States continuing near-flat at age 37. The drawn</w:t>
       </w:r>
       <w:r>
         <w:t xml:space="preserve"> </w:t>
@@ -2934,13 +2940,37 @@
         <w:t xml:space="preserve"> </w:t>
       </w:r>
       <w:r>
-        <w:t xml:space="preserve">re-rendered from the tagged data with the extrapolations redrawn, beside</w:t>
-      </w:r>
-      <w:r>
-        <w:t xml:space="preserve"> </w:t>
-      </w:r>
-      <w:r>
-        <w:t xml:space="preserve">the updated panels, with the extrapolations ghosted for comparison.</w:t>
+        <w:t xml:space="preserve">re-rendered from the tagged data with the extrapolations restored, beside</w:t>
+      </w:r>
+      <w:r>
+        <w:t xml:space="preserve"> </w:t>
+      </w:r>
+      <w:r>
+        <w:t xml:space="preserve">the updated panels. On these composites a replacement contour can end in</w:t>
+      </w:r>
+      <w:r>
+        <w:t xml:space="preserve"> </w:t>
+      </w:r>
+      <w:r>
+        <w:t xml:space="preserve">two ways, and the distinction carries the results: a contour that escapes</w:t>
+      </w:r>
+      <w:r>
+        <w:t xml:space="preserve"> </w:t>
+      </w:r>
+      <w:r>
+        <w:t xml:space="preserve">vertically through the top of a fully observed region marks cohorts that</w:t>
+      </w:r>
+      <w:r>
+        <w:t xml:space="preserve"> </w:t>
+      </w:r>
+      <w:r>
+        <w:t xml:space="preserve">never reach the milestone at any age, while a contour cut at the diagonal</w:t>
+      </w:r>
+      <w:r>
+        <w:t xml:space="preserve"> </w:t>
+      </w:r>
+      <w:r>
+        <w:t xml:space="preserve">data edge is merely censored.</w:t>
       </w:r>
       <w:r>
         <w:t xml:space="preserve"> </w:t>
@@ -3044,7 +3074,7 @@
               <w:t xml:space="preserve">demres-2020</w:t>
             </w:r>
             <w:r>
-              <w:t xml:space="preserve">), re-rendered in the current visual specification, with the 2020-era speculative extrapolations redrawn in magenta from the September 2018 working figure. Right column: the 2026 update, with the extrapolations ghosted. Heavy line: age at which each cohort’s CPCFR reaches 2.05; thin line: 1.50.</w:t>
+              <w:t xml:space="preserve">), re-rendered in the current visual specification, with the 2020-era speculative extrapolations in magenta, digitized from the September 2018 working figure (Supplement S7); they appear on the 2020-vintage panels only. Right column: the 2026 update. Heavy contour: CPCFR = 2.05 (replacement); thin: 1.50. Contours escaping through the top mark cohorts that never reach the milestone; contours cut at the data edge are censored.</w:t>
             </w:r>
           </w:p>
           <w:bookmarkEnd w:id="29"/>
@@ -3191,7 +3221,7 @@
                     <w:jc w:val="center"/>
                   </w:pPr>
                   <w:r>
-                    <w:t xml:space="preserve">Qualitatively correct; quantitatively optimistic: the loss was already complete at the data edge being read. No cohort born after 1971 reaches replacement at any observed age - the contour does not climb, it terminates. Period TFR 1.98 (2009) to 1.40 (2023).</w:t>
+                    <w:t xml:space="preserve">Qualitatively correct; quantitatively optimistic: the loss was already complete at the data edge being read. The drawn extrapolation held the contour near age 43 for a further decade of cohorts before its vertical exit; in the event the vertical escape comes immediately after the 1971 cohort - no later-born cohort reaches replacement at any observed age. Period TFR 1.98 (2009) to 1.40 (2023).</w:t>
                   </w:r>
                 </w:p>
               </w:tc>
@@ -3271,25 +3301,42 @@
         <w:t xml:space="preserve"> </w:t>
       </w:r>
       <w:r>
-        <w:t xml:space="preserve">- and then escapes vertically a second time for cohorts born after</w:t>
-      </w:r>
-      <w:r>
-        <w:t xml:space="preserve"> </w:t>
-      </w:r>
-      <w:r>
-        <w:t xml:space="preserve">approximately 1971. The 2020 forecast anticipated a gradual exit, the</w:t>
-      </w:r>
-      <w:r>
-        <w:t xml:space="preserve"> </w:t>
-      </w:r>
-      <w:r>
-        <w:t xml:space="preserve">contour climbing over roughly fifteen further cohorts; the realized exit</w:t>
-      </w:r>
-      <w:r>
-        <w:t xml:space="preserve"> </w:t>
-      </w:r>
-      <w:r>
-        <w:t xml:space="preserve">was immediate and total.</w:t>
+        <w:t xml:space="preserve">- and then escapes vertically a second time immediately after the 1971</w:t>
+      </w:r>
+      <w:r>
+        <w:t xml:space="preserve"> </w:t>
+      </w:r>
+      <w:r>
+        <w:t xml:space="preserve">cohort. The drawn 2020 forecast had anticipated the same shape but a</w:t>
+      </w:r>
+      <w:r>
+        <w:t xml:space="preserve"> </w:t>
+      </w:r>
+      <w:r>
+        <w:t xml:space="preserve">decade later: its dotted line holds near age 43 through cohorts born to</w:t>
+      </w:r>
+      <w:r>
+        <w:t xml:space="preserve"> </w:t>
+      </w:r>
+      <w:r>
+        <w:t xml:space="preserve">about 1981 before turning vertical (</w:t>
+      </w:r>
+      <w:hyperlink w:anchor="fig-2x2">
+        <w:r>
+          <w:rPr>
+            <w:rStyle w:val="Hyperlink"/>
+          </w:rPr>
+          <w:t xml:space="preserve">Figure 2</w:t>
+        </w:r>
+      </w:hyperlink>
+      <w:r>
+        <w:t xml:space="preserve">, left). The realized exit</w:t>
+      </w:r>
+      <w:r>
+        <w:t xml:space="preserve"> </w:t>
+      </w:r>
+      <w:r>
+        <w:t xml:space="preserve">came ten cohorts sooner, and was total.</w:t>
       </w:r>
     </w:p>
     <w:p>

</xml_diff>